<commit_message>
finalized snapshots and length of simulation
</commit_message>
<xml_diff>
--- a/writing/Natjecanje iz astronomije 2026.docx
+++ b/writing/Natjecanje iz astronomije 2026.docx
@@ -437,7 +437,7 @@
         <w:br w:type="page"/>
       </w:r>
     </w:p>
-    <w:bookmarkStart w:id="0" w:name="_Toc225707069" w:displacedByCustomXml="next"/>
+    <w:bookmarkStart w:id="0" w:name="_Toc225952494" w:displacedByCustomXml="next"/>
     <w:sdt>
       <w:sdtPr>
         <w:rPr>
@@ -486,14 +486,14 @@
               <w:tab w:val="right" w:leader="dot" w:pos="9016"/>
             </w:tabs>
             <w:rPr>
-              <w:rFonts w:ascii="Times New Roman" w:eastAsiaTheme="minorEastAsia" w:hAnsi="Times New Roman" w:cs="Times New Roman"/>
+              <w:rFonts w:eastAsiaTheme="minorEastAsia"/>
               <w:b w:val="0"/>
               <w:bCs w:val="0"/>
               <w:i w:val="0"/>
               <w:iCs w:val="0"/>
               <w:noProof/>
               <w:color w:val="auto"/>
-              <w:lang w:val="hr-HR" w:eastAsia="ja-JP"/>
+              <w:lang w:eastAsia="ja-JP"/>
             </w:rPr>
           </w:pPr>
           <w:r>
@@ -521,11 +521,11 @@
             </w:rPr>
             <w:fldChar w:fldCharType="separate"/>
           </w:r>
-          <w:hyperlink w:anchor="_Toc225707069" w:history="1">
+          <w:hyperlink w:anchor="_Toc225952494" w:history="1">
             <w:r>
               <w:rPr>
                 <w:rStyle w:val="Hyperlink"/>
-                <w:rFonts w:ascii="Times New Roman" w:hAnsi="Times New Roman" w:cs="Times New Roman"/>
+                <w:rFonts w:cs="Times New Roman"/>
                 <w:noProof/>
                 <w:lang w:val="hr-HR"/>
               </w:rPr>
@@ -533,63 +533,49 @@
             </w:r>
             <w:r>
               <w:rPr>
-                <w:rFonts w:ascii="Times New Roman" w:hAnsi="Times New Roman" w:cs="Times New Roman"/>
                 <w:noProof/>
                 <w:webHidden/>
-                <w:lang w:val="hr-HR"/>
               </w:rPr>
               <w:tab/>
             </w:r>
             <w:r>
               <w:rPr>
-                <w:rFonts w:ascii="Times New Roman" w:hAnsi="Times New Roman" w:cs="Times New Roman"/>
                 <w:noProof/>
                 <w:webHidden/>
-                <w:lang w:val="hr-HR"/>
               </w:rPr>
               <w:fldChar w:fldCharType="begin"/>
             </w:r>
             <w:r>
               <w:rPr>
-                <w:rFonts w:ascii="Times New Roman" w:hAnsi="Times New Roman" w:cs="Times New Roman"/>
                 <w:noProof/>
                 <w:webHidden/>
-                <w:lang w:val="hr-HR"/>
-              </w:rPr>
-              <w:instrText xml:space="preserve"> PAGEREF _Toc225707069 \h </w:instrText>
+              </w:rPr>
+              <w:instrText xml:space="preserve"> PAGEREF _Toc225952494 \h </w:instrText>
             </w:r>
             <w:r>
               <w:rPr>
-                <w:rFonts w:ascii="Times New Roman" w:hAnsi="Times New Roman" w:cs="Times New Roman"/>
                 <w:noProof/>
                 <w:webHidden/>
-                <w:lang w:val="hr-HR"/>
               </w:rPr>
             </w:r>
             <w:r>
               <w:rPr>
-                <w:rFonts w:ascii="Times New Roman" w:hAnsi="Times New Roman" w:cs="Times New Roman"/>
                 <w:noProof/>
                 <w:webHidden/>
-                <w:lang w:val="hr-HR"/>
               </w:rPr>
               <w:fldChar w:fldCharType="separate"/>
             </w:r>
             <w:r>
               <w:rPr>
-                <w:rFonts w:ascii="Times New Roman" w:hAnsi="Times New Roman" w:cs="Times New Roman"/>
                 <w:noProof/>
                 <w:webHidden/>
-                <w:lang w:val="hr-HR"/>
               </w:rPr>
               <w:t>2</w:t>
             </w:r>
             <w:r>
               <w:rPr>
-                <w:rFonts w:ascii="Times New Roman" w:hAnsi="Times New Roman" w:cs="Times New Roman"/>
                 <w:noProof/>
                 <w:webHidden/>
-                <w:lang w:val="hr-HR"/>
               </w:rPr>
               <w:fldChar w:fldCharType="end"/>
             </w:r>
@@ -602,21 +588,20 @@
               <w:tab w:val="right" w:leader="dot" w:pos="9016"/>
             </w:tabs>
             <w:rPr>
-              <w:rFonts w:ascii="Times New Roman" w:eastAsiaTheme="minorEastAsia" w:hAnsi="Times New Roman" w:cs="Times New Roman"/>
+              <w:rFonts w:eastAsiaTheme="minorEastAsia"/>
               <w:b w:val="0"/>
               <w:bCs w:val="0"/>
               <w:i w:val="0"/>
               <w:iCs w:val="0"/>
               <w:noProof/>
               <w:color w:val="auto"/>
-              <w:lang w:val="hr-HR" w:eastAsia="ja-JP"/>
+              <w:lang w:eastAsia="ja-JP"/>
             </w:rPr>
           </w:pPr>
-          <w:hyperlink w:anchor="_Toc225707070" w:history="1">
+          <w:hyperlink w:anchor="_Toc225952495" w:history="1">
             <w:r>
               <w:rPr>
                 <w:rStyle w:val="Hyperlink"/>
-                <w:rFonts w:ascii="Times New Roman" w:hAnsi="Times New Roman" w:cs="Times New Roman"/>
                 <w:noProof/>
                 <w:lang w:val="hr-HR"/>
               </w:rPr>
@@ -624,63 +609,49 @@
             </w:r>
             <w:r>
               <w:rPr>
-                <w:rFonts w:ascii="Times New Roman" w:hAnsi="Times New Roman" w:cs="Times New Roman"/>
                 <w:noProof/>
                 <w:webHidden/>
-                <w:lang w:val="hr-HR"/>
               </w:rPr>
               <w:tab/>
             </w:r>
             <w:r>
               <w:rPr>
-                <w:rFonts w:ascii="Times New Roman" w:hAnsi="Times New Roman" w:cs="Times New Roman"/>
                 <w:noProof/>
                 <w:webHidden/>
-                <w:lang w:val="hr-HR"/>
               </w:rPr>
               <w:fldChar w:fldCharType="begin"/>
             </w:r>
             <w:r>
               <w:rPr>
-                <w:rFonts w:ascii="Times New Roman" w:hAnsi="Times New Roman" w:cs="Times New Roman"/>
                 <w:noProof/>
                 <w:webHidden/>
-                <w:lang w:val="hr-HR"/>
-              </w:rPr>
-              <w:instrText xml:space="preserve"> PAGEREF _Toc225707070 \h </w:instrText>
+              </w:rPr>
+              <w:instrText xml:space="preserve"> PAGEREF _Toc225952495 \h </w:instrText>
             </w:r>
             <w:r>
               <w:rPr>
-                <w:rFonts w:ascii="Times New Roman" w:hAnsi="Times New Roman" w:cs="Times New Roman"/>
                 <w:noProof/>
                 <w:webHidden/>
-                <w:lang w:val="hr-HR"/>
               </w:rPr>
             </w:r>
             <w:r>
               <w:rPr>
-                <w:rFonts w:ascii="Times New Roman" w:hAnsi="Times New Roman" w:cs="Times New Roman"/>
                 <w:noProof/>
                 <w:webHidden/>
-                <w:lang w:val="hr-HR"/>
               </w:rPr>
               <w:fldChar w:fldCharType="separate"/>
             </w:r>
             <w:r>
               <w:rPr>
-                <w:rFonts w:ascii="Times New Roman" w:hAnsi="Times New Roman" w:cs="Times New Roman"/>
                 <w:noProof/>
                 <w:webHidden/>
-                <w:lang w:val="hr-HR"/>
               </w:rPr>
               <w:t>3</w:t>
             </w:r>
             <w:r>
               <w:rPr>
-                <w:rFonts w:ascii="Times New Roman" w:hAnsi="Times New Roman" w:cs="Times New Roman"/>
                 <w:noProof/>
                 <w:webHidden/>
-                <w:lang w:val="hr-HR"/>
               </w:rPr>
               <w:fldChar w:fldCharType="end"/>
             </w:r>
@@ -693,21 +664,20 @@
               <w:tab w:val="right" w:leader="dot" w:pos="9016"/>
             </w:tabs>
             <w:rPr>
-              <w:rFonts w:ascii="Times New Roman" w:eastAsiaTheme="minorEastAsia" w:hAnsi="Times New Roman" w:cs="Times New Roman"/>
+              <w:rFonts w:eastAsiaTheme="minorEastAsia"/>
               <w:b w:val="0"/>
               <w:bCs w:val="0"/>
               <w:i w:val="0"/>
               <w:iCs w:val="0"/>
               <w:noProof/>
               <w:color w:val="auto"/>
-              <w:lang w:val="hr-HR" w:eastAsia="ja-JP"/>
+              <w:lang w:eastAsia="ja-JP"/>
             </w:rPr>
           </w:pPr>
-          <w:hyperlink w:anchor="_Toc225707071" w:history="1">
+          <w:hyperlink w:anchor="_Toc225952496" w:history="1">
             <w:r>
               <w:rPr>
                 <w:rStyle w:val="Hyperlink"/>
-                <w:rFonts w:ascii="Times New Roman" w:hAnsi="Times New Roman" w:cs="Times New Roman"/>
                 <w:noProof/>
                 <w:lang w:val="hr-HR"/>
               </w:rPr>
@@ -715,63 +685,49 @@
             </w:r>
             <w:r>
               <w:rPr>
-                <w:rFonts w:ascii="Times New Roman" w:hAnsi="Times New Roman" w:cs="Times New Roman"/>
                 <w:noProof/>
                 <w:webHidden/>
-                <w:lang w:val="hr-HR"/>
               </w:rPr>
               <w:tab/>
             </w:r>
             <w:r>
               <w:rPr>
-                <w:rFonts w:ascii="Times New Roman" w:hAnsi="Times New Roman" w:cs="Times New Roman"/>
                 <w:noProof/>
                 <w:webHidden/>
-                <w:lang w:val="hr-HR"/>
               </w:rPr>
               <w:fldChar w:fldCharType="begin"/>
             </w:r>
             <w:r>
               <w:rPr>
-                <w:rFonts w:ascii="Times New Roman" w:hAnsi="Times New Roman" w:cs="Times New Roman"/>
                 <w:noProof/>
                 <w:webHidden/>
-                <w:lang w:val="hr-HR"/>
-              </w:rPr>
-              <w:instrText xml:space="preserve"> PAGEREF _Toc225707071 \h </w:instrText>
+              </w:rPr>
+              <w:instrText xml:space="preserve"> PAGEREF _Toc225952496 \h </w:instrText>
             </w:r>
             <w:r>
               <w:rPr>
-                <w:rFonts w:ascii="Times New Roman" w:hAnsi="Times New Roman" w:cs="Times New Roman"/>
                 <w:noProof/>
                 <w:webHidden/>
-                <w:lang w:val="hr-HR"/>
               </w:rPr>
             </w:r>
             <w:r>
               <w:rPr>
-                <w:rFonts w:ascii="Times New Roman" w:hAnsi="Times New Roman" w:cs="Times New Roman"/>
                 <w:noProof/>
                 <w:webHidden/>
-                <w:lang w:val="hr-HR"/>
               </w:rPr>
               <w:fldChar w:fldCharType="separate"/>
             </w:r>
             <w:r>
               <w:rPr>
-                <w:rFonts w:ascii="Times New Roman" w:hAnsi="Times New Roman" w:cs="Times New Roman"/>
                 <w:noProof/>
                 <w:webHidden/>
-                <w:lang w:val="hr-HR"/>
               </w:rPr>
               <w:t>4</w:t>
             </w:r>
             <w:r>
               <w:rPr>
-                <w:rFonts w:ascii="Times New Roman" w:hAnsi="Times New Roman" w:cs="Times New Roman"/>
                 <w:noProof/>
                 <w:webHidden/>
-                <w:lang w:val="hr-HR"/>
               </w:rPr>
               <w:fldChar w:fldCharType="end"/>
             </w:r>
@@ -784,21 +740,20 @@
               <w:tab w:val="right" w:leader="dot" w:pos="9016"/>
             </w:tabs>
             <w:rPr>
-              <w:rFonts w:ascii="Times New Roman" w:eastAsiaTheme="minorEastAsia" w:hAnsi="Times New Roman" w:cs="Times New Roman"/>
+              <w:rFonts w:eastAsiaTheme="minorEastAsia"/>
               <w:b w:val="0"/>
               <w:bCs w:val="0"/>
               <w:i w:val="0"/>
               <w:iCs w:val="0"/>
               <w:noProof/>
               <w:color w:val="auto"/>
-              <w:lang w:val="hr-HR" w:eastAsia="ja-JP"/>
+              <w:lang w:eastAsia="ja-JP"/>
             </w:rPr>
           </w:pPr>
-          <w:hyperlink w:anchor="_Toc225707072" w:history="1">
+          <w:hyperlink w:anchor="_Toc225952497" w:history="1">
             <w:r>
               <w:rPr>
                 <w:rStyle w:val="Hyperlink"/>
-                <w:rFonts w:ascii="Times New Roman" w:hAnsi="Times New Roman" w:cs="Times New Roman"/>
                 <w:noProof/>
                 <w:lang w:val="hr-HR"/>
               </w:rPr>
@@ -806,63 +761,49 @@
             </w:r>
             <w:r>
               <w:rPr>
-                <w:rFonts w:ascii="Times New Roman" w:hAnsi="Times New Roman" w:cs="Times New Roman"/>
                 <w:noProof/>
                 <w:webHidden/>
-                <w:lang w:val="hr-HR"/>
               </w:rPr>
               <w:tab/>
             </w:r>
             <w:r>
               <w:rPr>
-                <w:rFonts w:ascii="Times New Roman" w:hAnsi="Times New Roman" w:cs="Times New Roman"/>
                 <w:noProof/>
                 <w:webHidden/>
-                <w:lang w:val="hr-HR"/>
               </w:rPr>
               <w:fldChar w:fldCharType="begin"/>
             </w:r>
             <w:r>
               <w:rPr>
-                <w:rFonts w:ascii="Times New Roman" w:hAnsi="Times New Roman" w:cs="Times New Roman"/>
                 <w:noProof/>
                 <w:webHidden/>
-                <w:lang w:val="hr-HR"/>
-              </w:rPr>
-              <w:instrText xml:space="preserve"> PAGEREF _Toc225707072 \h </w:instrText>
+              </w:rPr>
+              <w:instrText xml:space="preserve"> PAGEREF _Toc225952497 \h </w:instrText>
             </w:r>
             <w:r>
               <w:rPr>
-                <w:rFonts w:ascii="Times New Roman" w:hAnsi="Times New Roman" w:cs="Times New Roman"/>
                 <w:noProof/>
                 <w:webHidden/>
-                <w:lang w:val="hr-HR"/>
               </w:rPr>
             </w:r>
             <w:r>
               <w:rPr>
-                <w:rFonts w:ascii="Times New Roman" w:hAnsi="Times New Roman" w:cs="Times New Roman"/>
                 <w:noProof/>
                 <w:webHidden/>
-                <w:lang w:val="hr-HR"/>
               </w:rPr>
               <w:fldChar w:fldCharType="separate"/>
             </w:r>
             <w:r>
               <w:rPr>
-                <w:rFonts w:ascii="Times New Roman" w:hAnsi="Times New Roman" w:cs="Times New Roman"/>
                 <w:noProof/>
                 <w:webHidden/>
-                <w:lang w:val="hr-HR"/>
               </w:rPr>
               <w:t>6</w:t>
             </w:r>
             <w:r>
               <w:rPr>
-                <w:rFonts w:ascii="Times New Roman" w:hAnsi="Times New Roman" w:cs="Times New Roman"/>
                 <w:noProof/>
                 <w:webHidden/>
-                <w:lang w:val="hr-HR"/>
               </w:rPr>
               <w:fldChar w:fldCharType="end"/>
             </w:r>
@@ -875,21 +816,20 @@
               <w:tab w:val="right" w:leader="dot" w:pos="9016"/>
             </w:tabs>
             <w:rPr>
-              <w:rFonts w:ascii="Times New Roman" w:eastAsiaTheme="minorEastAsia" w:hAnsi="Times New Roman" w:cs="Times New Roman"/>
+              <w:rFonts w:eastAsiaTheme="minorEastAsia"/>
               <w:b w:val="0"/>
               <w:bCs w:val="0"/>
               <w:noProof/>
               <w:color w:val="auto"/>
               <w:sz w:val="24"/>
               <w:szCs w:val="24"/>
-              <w:lang w:val="hr-HR" w:eastAsia="ja-JP"/>
+              <w:lang w:eastAsia="ja-JP"/>
             </w:rPr>
           </w:pPr>
-          <w:hyperlink w:anchor="_Toc225707073" w:history="1">
+          <w:hyperlink w:anchor="_Toc225952498" w:history="1">
             <w:r>
               <w:rPr>
                 <w:rStyle w:val="Hyperlink"/>
-                <w:rFonts w:ascii="Times New Roman" w:hAnsi="Times New Roman" w:cs="Times New Roman"/>
                 <w:noProof/>
                 <w:lang w:val="hr-HR"/>
               </w:rPr>
@@ -897,63 +837,49 @@
             </w:r>
             <w:r>
               <w:rPr>
-                <w:rFonts w:ascii="Times New Roman" w:hAnsi="Times New Roman" w:cs="Times New Roman"/>
                 <w:noProof/>
                 <w:webHidden/>
-                <w:lang w:val="hr-HR"/>
               </w:rPr>
               <w:tab/>
             </w:r>
             <w:r>
               <w:rPr>
-                <w:rFonts w:ascii="Times New Roman" w:hAnsi="Times New Roman" w:cs="Times New Roman"/>
                 <w:noProof/>
                 <w:webHidden/>
-                <w:lang w:val="hr-HR"/>
               </w:rPr>
               <w:fldChar w:fldCharType="begin"/>
             </w:r>
             <w:r>
               <w:rPr>
-                <w:rFonts w:ascii="Times New Roman" w:hAnsi="Times New Roman" w:cs="Times New Roman"/>
                 <w:noProof/>
                 <w:webHidden/>
-                <w:lang w:val="hr-HR"/>
-              </w:rPr>
-              <w:instrText xml:space="preserve"> PAGEREF _Toc225707073 \h </w:instrText>
+              </w:rPr>
+              <w:instrText xml:space="preserve"> PAGEREF _Toc225952498 \h </w:instrText>
             </w:r>
             <w:r>
               <w:rPr>
-                <w:rFonts w:ascii="Times New Roman" w:hAnsi="Times New Roman" w:cs="Times New Roman"/>
                 <w:noProof/>
                 <w:webHidden/>
-                <w:lang w:val="hr-HR"/>
               </w:rPr>
             </w:r>
             <w:r>
               <w:rPr>
-                <w:rFonts w:ascii="Times New Roman" w:hAnsi="Times New Roman" w:cs="Times New Roman"/>
                 <w:noProof/>
                 <w:webHidden/>
-                <w:lang w:val="hr-HR"/>
               </w:rPr>
               <w:fldChar w:fldCharType="separate"/>
             </w:r>
             <w:r>
               <w:rPr>
-                <w:rFonts w:ascii="Times New Roman" w:hAnsi="Times New Roman" w:cs="Times New Roman"/>
                 <w:noProof/>
                 <w:webHidden/>
-                <w:lang w:val="hr-HR"/>
               </w:rPr>
               <w:t>6</w:t>
             </w:r>
             <w:r>
               <w:rPr>
-                <w:rFonts w:ascii="Times New Roman" w:hAnsi="Times New Roman" w:cs="Times New Roman"/>
                 <w:noProof/>
                 <w:webHidden/>
-                <w:lang w:val="hr-HR"/>
               </w:rPr>
               <w:fldChar w:fldCharType="end"/>
             </w:r>
@@ -966,21 +892,20 @@
               <w:tab w:val="right" w:leader="dot" w:pos="9016"/>
             </w:tabs>
             <w:rPr>
-              <w:rFonts w:ascii="Times New Roman" w:eastAsiaTheme="minorEastAsia" w:hAnsi="Times New Roman" w:cs="Times New Roman"/>
+              <w:rFonts w:eastAsiaTheme="minorEastAsia"/>
               <w:b w:val="0"/>
               <w:bCs w:val="0"/>
               <w:noProof/>
               <w:color w:val="auto"/>
               <w:sz w:val="24"/>
               <w:szCs w:val="24"/>
-              <w:lang w:val="hr-HR" w:eastAsia="ja-JP"/>
+              <w:lang w:eastAsia="ja-JP"/>
             </w:rPr>
           </w:pPr>
-          <w:hyperlink w:anchor="_Toc225707074" w:history="1">
+          <w:hyperlink w:anchor="_Toc225952499" w:history="1">
             <w:r>
               <w:rPr>
                 <w:rStyle w:val="Hyperlink"/>
-                <w:rFonts w:ascii="Times New Roman" w:hAnsi="Times New Roman" w:cs="Times New Roman"/>
                 <w:noProof/>
                 <w:lang w:val="hr-HR"/>
               </w:rPr>
@@ -988,63 +913,49 @@
             </w:r>
             <w:r>
               <w:rPr>
-                <w:rFonts w:ascii="Times New Roman" w:hAnsi="Times New Roman" w:cs="Times New Roman"/>
                 <w:noProof/>
                 <w:webHidden/>
-                <w:lang w:val="hr-HR"/>
               </w:rPr>
               <w:tab/>
             </w:r>
             <w:r>
               <w:rPr>
-                <w:rFonts w:ascii="Times New Roman" w:hAnsi="Times New Roman" w:cs="Times New Roman"/>
                 <w:noProof/>
                 <w:webHidden/>
-                <w:lang w:val="hr-HR"/>
               </w:rPr>
               <w:fldChar w:fldCharType="begin"/>
             </w:r>
             <w:r>
               <w:rPr>
-                <w:rFonts w:ascii="Times New Roman" w:hAnsi="Times New Roman" w:cs="Times New Roman"/>
                 <w:noProof/>
                 <w:webHidden/>
-                <w:lang w:val="hr-HR"/>
-              </w:rPr>
-              <w:instrText xml:space="preserve"> PAGEREF _Toc225707074 \h </w:instrText>
+              </w:rPr>
+              <w:instrText xml:space="preserve"> PAGEREF _Toc225952499 \h </w:instrText>
             </w:r>
             <w:r>
               <w:rPr>
-                <w:rFonts w:ascii="Times New Roman" w:hAnsi="Times New Roman" w:cs="Times New Roman"/>
                 <w:noProof/>
                 <w:webHidden/>
-                <w:lang w:val="hr-HR"/>
               </w:rPr>
             </w:r>
             <w:r>
               <w:rPr>
-                <w:rFonts w:ascii="Times New Roman" w:hAnsi="Times New Roman" w:cs="Times New Roman"/>
                 <w:noProof/>
                 <w:webHidden/>
-                <w:lang w:val="hr-HR"/>
               </w:rPr>
               <w:fldChar w:fldCharType="separate"/>
             </w:r>
             <w:r>
               <w:rPr>
-                <w:rFonts w:ascii="Times New Roman" w:hAnsi="Times New Roman" w:cs="Times New Roman"/>
                 <w:noProof/>
                 <w:webHidden/>
-                <w:lang w:val="hr-HR"/>
               </w:rPr>
               <w:t>8</w:t>
             </w:r>
             <w:r>
               <w:rPr>
-                <w:rFonts w:ascii="Times New Roman" w:hAnsi="Times New Roman" w:cs="Times New Roman"/>
                 <w:noProof/>
                 <w:webHidden/>
-                <w:lang w:val="hr-HR"/>
               </w:rPr>
               <w:fldChar w:fldCharType="end"/>
             </w:r>
@@ -1057,21 +968,20 @@
               <w:tab w:val="right" w:leader="dot" w:pos="9016"/>
             </w:tabs>
             <w:rPr>
-              <w:rFonts w:ascii="Times New Roman" w:eastAsiaTheme="minorEastAsia" w:hAnsi="Times New Roman" w:cs="Times New Roman"/>
+              <w:rFonts w:eastAsiaTheme="minorEastAsia"/>
               <w:b w:val="0"/>
               <w:bCs w:val="0"/>
               <w:noProof/>
               <w:color w:val="auto"/>
               <w:sz w:val="24"/>
               <w:szCs w:val="24"/>
-              <w:lang w:val="hr-HR" w:eastAsia="ja-JP"/>
+              <w:lang w:eastAsia="ja-JP"/>
             </w:rPr>
           </w:pPr>
-          <w:hyperlink w:anchor="_Toc225707075" w:history="1">
+          <w:hyperlink w:anchor="_Toc225952500" w:history="1">
             <w:r>
               <w:rPr>
                 <w:rStyle w:val="Hyperlink"/>
-                <w:rFonts w:ascii="Times New Roman" w:hAnsi="Times New Roman" w:cs="Times New Roman"/>
                 <w:noProof/>
                 <w:lang w:val="hr-HR"/>
               </w:rPr>
@@ -1079,63 +989,49 @@
             </w:r>
             <w:r>
               <w:rPr>
-                <w:rFonts w:ascii="Times New Roman" w:hAnsi="Times New Roman" w:cs="Times New Roman"/>
                 <w:noProof/>
                 <w:webHidden/>
-                <w:lang w:val="hr-HR"/>
               </w:rPr>
               <w:tab/>
             </w:r>
             <w:r>
               <w:rPr>
-                <w:rFonts w:ascii="Times New Roman" w:hAnsi="Times New Roman" w:cs="Times New Roman"/>
                 <w:noProof/>
                 <w:webHidden/>
-                <w:lang w:val="hr-HR"/>
               </w:rPr>
               <w:fldChar w:fldCharType="begin"/>
             </w:r>
             <w:r>
               <w:rPr>
-                <w:rFonts w:ascii="Times New Roman" w:hAnsi="Times New Roman" w:cs="Times New Roman"/>
                 <w:noProof/>
                 <w:webHidden/>
-                <w:lang w:val="hr-HR"/>
-              </w:rPr>
-              <w:instrText xml:space="preserve"> PAGEREF _Toc225707075 \h </w:instrText>
+              </w:rPr>
+              <w:instrText xml:space="preserve"> PAGEREF _Toc225952500 \h </w:instrText>
             </w:r>
             <w:r>
               <w:rPr>
-                <w:rFonts w:ascii="Times New Roman" w:hAnsi="Times New Roman" w:cs="Times New Roman"/>
                 <w:noProof/>
                 <w:webHidden/>
-                <w:lang w:val="hr-HR"/>
               </w:rPr>
             </w:r>
             <w:r>
               <w:rPr>
-                <w:rFonts w:ascii="Times New Roman" w:hAnsi="Times New Roman" w:cs="Times New Roman"/>
                 <w:noProof/>
                 <w:webHidden/>
-                <w:lang w:val="hr-HR"/>
               </w:rPr>
               <w:fldChar w:fldCharType="separate"/>
             </w:r>
             <w:r>
               <w:rPr>
-                <w:rFonts w:ascii="Times New Roman" w:hAnsi="Times New Roman" w:cs="Times New Roman"/>
                 <w:noProof/>
                 <w:webHidden/>
-                <w:lang w:val="hr-HR"/>
               </w:rPr>
               <w:t>9</w:t>
             </w:r>
             <w:r>
               <w:rPr>
-                <w:rFonts w:ascii="Times New Roman" w:hAnsi="Times New Roman" w:cs="Times New Roman"/>
                 <w:noProof/>
                 <w:webHidden/>
-                <w:lang w:val="hr-HR"/>
               </w:rPr>
               <w:fldChar w:fldCharType="end"/>
             </w:r>
@@ -1148,21 +1044,20 @@
               <w:tab w:val="right" w:leader="dot" w:pos="9016"/>
             </w:tabs>
             <w:rPr>
-              <w:rFonts w:ascii="Times New Roman" w:eastAsiaTheme="minorEastAsia" w:hAnsi="Times New Roman" w:cs="Times New Roman"/>
+              <w:rFonts w:eastAsiaTheme="minorEastAsia"/>
               <w:b w:val="0"/>
               <w:bCs w:val="0"/>
               <w:i w:val="0"/>
               <w:iCs w:val="0"/>
               <w:noProof/>
               <w:color w:val="auto"/>
-              <w:lang w:val="hr-HR" w:eastAsia="ja-JP"/>
+              <w:lang w:eastAsia="ja-JP"/>
             </w:rPr>
           </w:pPr>
-          <w:hyperlink w:anchor="_Toc225707076" w:history="1">
+          <w:hyperlink w:anchor="_Toc225952501" w:history="1">
             <w:r>
               <w:rPr>
                 <w:rStyle w:val="Hyperlink"/>
-                <w:rFonts w:ascii="Times New Roman" w:hAnsi="Times New Roman" w:cs="Times New Roman"/>
                 <w:noProof/>
                 <w:lang w:val="hr-HR"/>
               </w:rPr>
@@ -1170,63 +1065,49 @@
             </w:r>
             <w:r>
               <w:rPr>
-                <w:rFonts w:ascii="Times New Roman" w:hAnsi="Times New Roman" w:cs="Times New Roman"/>
                 <w:noProof/>
                 <w:webHidden/>
-                <w:lang w:val="hr-HR"/>
               </w:rPr>
               <w:tab/>
             </w:r>
             <w:r>
               <w:rPr>
-                <w:rFonts w:ascii="Times New Roman" w:hAnsi="Times New Roman" w:cs="Times New Roman"/>
                 <w:noProof/>
                 <w:webHidden/>
-                <w:lang w:val="hr-HR"/>
               </w:rPr>
               <w:fldChar w:fldCharType="begin"/>
             </w:r>
             <w:r>
               <w:rPr>
-                <w:rFonts w:ascii="Times New Roman" w:hAnsi="Times New Roman" w:cs="Times New Roman"/>
                 <w:noProof/>
                 <w:webHidden/>
-                <w:lang w:val="hr-HR"/>
-              </w:rPr>
-              <w:instrText xml:space="preserve"> PAGEREF _Toc225707076 \h </w:instrText>
+              </w:rPr>
+              <w:instrText xml:space="preserve"> PAGEREF _Toc225952501 \h </w:instrText>
             </w:r>
             <w:r>
               <w:rPr>
-                <w:rFonts w:ascii="Times New Roman" w:hAnsi="Times New Roman" w:cs="Times New Roman"/>
                 <w:noProof/>
                 <w:webHidden/>
-                <w:lang w:val="hr-HR"/>
               </w:rPr>
             </w:r>
             <w:r>
               <w:rPr>
-                <w:rFonts w:ascii="Times New Roman" w:hAnsi="Times New Roman" w:cs="Times New Roman"/>
                 <w:noProof/>
                 <w:webHidden/>
-                <w:lang w:val="hr-HR"/>
               </w:rPr>
               <w:fldChar w:fldCharType="separate"/>
             </w:r>
             <w:r>
               <w:rPr>
-                <w:rFonts w:ascii="Times New Roman" w:hAnsi="Times New Roman" w:cs="Times New Roman"/>
                 <w:noProof/>
                 <w:webHidden/>
-                <w:lang w:val="hr-HR"/>
               </w:rPr>
               <w:t>10</w:t>
             </w:r>
             <w:r>
               <w:rPr>
-                <w:rFonts w:ascii="Times New Roman" w:hAnsi="Times New Roman" w:cs="Times New Roman"/>
                 <w:noProof/>
                 <w:webHidden/>
-                <w:lang w:val="hr-HR"/>
               </w:rPr>
               <w:fldChar w:fldCharType="end"/>
             </w:r>
@@ -1239,21 +1120,20 @@
               <w:tab w:val="right" w:leader="dot" w:pos="9016"/>
             </w:tabs>
             <w:rPr>
-              <w:rFonts w:ascii="Times New Roman" w:eastAsiaTheme="minorEastAsia" w:hAnsi="Times New Roman" w:cs="Times New Roman"/>
+              <w:rFonts w:eastAsiaTheme="minorEastAsia"/>
               <w:b w:val="0"/>
               <w:bCs w:val="0"/>
               <w:noProof/>
               <w:color w:val="auto"/>
               <w:sz w:val="24"/>
               <w:szCs w:val="24"/>
-              <w:lang w:val="hr-HR" w:eastAsia="ja-JP"/>
+              <w:lang w:eastAsia="ja-JP"/>
             </w:rPr>
           </w:pPr>
-          <w:hyperlink w:anchor="_Toc225707077" w:history="1">
+          <w:hyperlink w:anchor="_Toc225952502" w:history="1">
             <w:r>
               <w:rPr>
                 <w:rStyle w:val="Hyperlink"/>
-                <w:rFonts w:ascii="Times New Roman" w:hAnsi="Times New Roman" w:cs="Times New Roman"/>
                 <w:noProof/>
                 <w:lang w:val="hr-HR"/>
               </w:rPr>
@@ -1261,63 +1141,49 @@
             </w:r>
             <w:r>
               <w:rPr>
-                <w:rFonts w:ascii="Times New Roman" w:hAnsi="Times New Roman" w:cs="Times New Roman"/>
                 <w:noProof/>
                 <w:webHidden/>
-                <w:lang w:val="hr-HR"/>
               </w:rPr>
               <w:tab/>
             </w:r>
             <w:r>
               <w:rPr>
-                <w:rFonts w:ascii="Times New Roman" w:hAnsi="Times New Roman" w:cs="Times New Roman"/>
                 <w:noProof/>
                 <w:webHidden/>
-                <w:lang w:val="hr-HR"/>
               </w:rPr>
               <w:fldChar w:fldCharType="begin"/>
             </w:r>
             <w:r>
               <w:rPr>
-                <w:rFonts w:ascii="Times New Roman" w:hAnsi="Times New Roman" w:cs="Times New Roman"/>
                 <w:noProof/>
                 <w:webHidden/>
-                <w:lang w:val="hr-HR"/>
-              </w:rPr>
-              <w:instrText xml:space="preserve"> PAGEREF _Toc225707077 \h </w:instrText>
+              </w:rPr>
+              <w:instrText xml:space="preserve"> PAGEREF _Toc225952502 \h </w:instrText>
             </w:r>
             <w:r>
               <w:rPr>
-                <w:rFonts w:ascii="Times New Roman" w:hAnsi="Times New Roman" w:cs="Times New Roman"/>
                 <w:noProof/>
                 <w:webHidden/>
-                <w:lang w:val="hr-HR"/>
               </w:rPr>
             </w:r>
             <w:r>
               <w:rPr>
-                <w:rFonts w:ascii="Times New Roman" w:hAnsi="Times New Roman" w:cs="Times New Roman"/>
                 <w:noProof/>
                 <w:webHidden/>
-                <w:lang w:val="hr-HR"/>
               </w:rPr>
               <w:fldChar w:fldCharType="separate"/>
             </w:r>
             <w:r>
               <w:rPr>
-                <w:rFonts w:ascii="Times New Roman" w:hAnsi="Times New Roman" w:cs="Times New Roman"/>
                 <w:noProof/>
                 <w:webHidden/>
-                <w:lang w:val="hr-HR"/>
               </w:rPr>
               <w:t>10</w:t>
             </w:r>
             <w:r>
               <w:rPr>
-                <w:rFonts w:ascii="Times New Roman" w:hAnsi="Times New Roman" w:cs="Times New Roman"/>
                 <w:noProof/>
                 <w:webHidden/>
-                <w:lang w:val="hr-HR"/>
               </w:rPr>
               <w:fldChar w:fldCharType="end"/>
             </w:r>
@@ -1330,21 +1196,20 @@
               <w:tab w:val="right" w:leader="dot" w:pos="9016"/>
             </w:tabs>
             <w:rPr>
-              <w:rFonts w:ascii="Times New Roman" w:eastAsiaTheme="minorEastAsia" w:hAnsi="Times New Roman" w:cs="Times New Roman"/>
+              <w:rFonts w:eastAsiaTheme="minorEastAsia"/>
               <w:b w:val="0"/>
               <w:bCs w:val="0"/>
               <w:noProof/>
               <w:color w:val="auto"/>
               <w:sz w:val="24"/>
               <w:szCs w:val="24"/>
-              <w:lang w:val="hr-HR" w:eastAsia="ja-JP"/>
+              <w:lang w:eastAsia="ja-JP"/>
             </w:rPr>
           </w:pPr>
-          <w:hyperlink w:anchor="_Toc225707078" w:history="1">
+          <w:hyperlink w:anchor="_Toc225952503" w:history="1">
             <w:r>
               <w:rPr>
                 <w:rStyle w:val="Hyperlink"/>
-                <w:rFonts w:ascii="Times New Roman" w:hAnsi="Times New Roman" w:cs="Times New Roman"/>
                 <w:noProof/>
                 <w:lang w:val="hr-HR"/>
               </w:rPr>
@@ -1352,63 +1217,49 @@
             </w:r>
             <w:r>
               <w:rPr>
-                <w:rFonts w:ascii="Times New Roman" w:hAnsi="Times New Roman" w:cs="Times New Roman"/>
                 <w:noProof/>
                 <w:webHidden/>
-                <w:lang w:val="hr-HR"/>
               </w:rPr>
               <w:tab/>
             </w:r>
             <w:r>
               <w:rPr>
-                <w:rFonts w:ascii="Times New Roman" w:hAnsi="Times New Roman" w:cs="Times New Roman"/>
                 <w:noProof/>
                 <w:webHidden/>
-                <w:lang w:val="hr-HR"/>
               </w:rPr>
               <w:fldChar w:fldCharType="begin"/>
             </w:r>
             <w:r>
               <w:rPr>
-                <w:rFonts w:ascii="Times New Roman" w:hAnsi="Times New Roman" w:cs="Times New Roman"/>
                 <w:noProof/>
                 <w:webHidden/>
-                <w:lang w:val="hr-HR"/>
-              </w:rPr>
-              <w:instrText xml:space="preserve"> PAGEREF _Toc225707078 \h </w:instrText>
+              </w:rPr>
+              <w:instrText xml:space="preserve"> PAGEREF _Toc225952503 \h </w:instrText>
             </w:r>
             <w:r>
               <w:rPr>
-                <w:rFonts w:ascii="Times New Roman" w:hAnsi="Times New Roman" w:cs="Times New Roman"/>
                 <w:noProof/>
                 <w:webHidden/>
-                <w:lang w:val="hr-HR"/>
               </w:rPr>
             </w:r>
             <w:r>
               <w:rPr>
-                <w:rFonts w:ascii="Times New Roman" w:hAnsi="Times New Roman" w:cs="Times New Roman"/>
                 <w:noProof/>
                 <w:webHidden/>
-                <w:lang w:val="hr-HR"/>
               </w:rPr>
               <w:fldChar w:fldCharType="separate"/>
             </w:r>
             <w:r>
               <w:rPr>
-                <w:rFonts w:ascii="Times New Roman" w:hAnsi="Times New Roman" w:cs="Times New Roman"/>
                 <w:noProof/>
                 <w:webHidden/>
-                <w:lang w:val="hr-HR"/>
-              </w:rPr>
-              <w:t>12</w:t>
+              </w:rPr>
+              <w:t>13</w:t>
             </w:r>
             <w:r>
               <w:rPr>
-                <w:rFonts w:ascii="Times New Roman" w:hAnsi="Times New Roman" w:cs="Times New Roman"/>
                 <w:noProof/>
                 <w:webHidden/>
-                <w:lang w:val="hr-HR"/>
               </w:rPr>
               <w:fldChar w:fldCharType="end"/>
             </w:r>
@@ -1421,21 +1272,20 @@
               <w:tab w:val="right" w:leader="dot" w:pos="9016"/>
             </w:tabs>
             <w:rPr>
-              <w:rFonts w:ascii="Times New Roman" w:eastAsiaTheme="minorEastAsia" w:hAnsi="Times New Roman" w:cs="Times New Roman"/>
+              <w:rFonts w:eastAsiaTheme="minorEastAsia"/>
               <w:b w:val="0"/>
               <w:bCs w:val="0"/>
               <w:i w:val="0"/>
               <w:iCs w:val="0"/>
               <w:noProof/>
               <w:color w:val="auto"/>
-              <w:lang w:val="hr-HR" w:eastAsia="ja-JP"/>
+              <w:lang w:eastAsia="ja-JP"/>
             </w:rPr>
           </w:pPr>
-          <w:hyperlink w:anchor="_Toc225707079" w:history="1">
+          <w:hyperlink w:anchor="_Toc225952504" w:history="1">
             <w:r>
               <w:rPr>
                 <w:rStyle w:val="Hyperlink"/>
-                <w:rFonts w:ascii="Times New Roman" w:hAnsi="Times New Roman" w:cs="Times New Roman"/>
                 <w:noProof/>
                 <w:lang w:val="hr-HR"/>
               </w:rPr>
@@ -1443,63 +1293,49 @@
             </w:r>
             <w:r>
               <w:rPr>
-                <w:rFonts w:ascii="Times New Roman" w:hAnsi="Times New Roman" w:cs="Times New Roman"/>
                 <w:noProof/>
                 <w:webHidden/>
-                <w:lang w:val="hr-HR"/>
               </w:rPr>
               <w:tab/>
             </w:r>
             <w:r>
               <w:rPr>
-                <w:rFonts w:ascii="Times New Roman" w:hAnsi="Times New Roman" w:cs="Times New Roman"/>
                 <w:noProof/>
                 <w:webHidden/>
-                <w:lang w:val="hr-HR"/>
               </w:rPr>
               <w:fldChar w:fldCharType="begin"/>
             </w:r>
             <w:r>
               <w:rPr>
-                <w:rFonts w:ascii="Times New Roman" w:hAnsi="Times New Roman" w:cs="Times New Roman"/>
                 <w:noProof/>
                 <w:webHidden/>
-                <w:lang w:val="hr-HR"/>
-              </w:rPr>
-              <w:instrText xml:space="preserve"> PAGEREF _Toc225707079 \h </w:instrText>
+              </w:rPr>
+              <w:instrText xml:space="preserve"> PAGEREF _Toc225952504 \h </w:instrText>
             </w:r>
             <w:r>
               <w:rPr>
-                <w:rFonts w:ascii="Times New Roman" w:hAnsi="Times New Roman" w:cs="Times New Roman"/>
                 <w:noProof/>
                 <w:webHidden/>
-                <w:lang w:val="hr-HR"/>
               </w:rPr>
             </w:r>
             <w:r>
               <w:rPr>
-                <w:rFonts w:ascii="Times New Roman" w:hAnsi="Times New Roman" w:cs="Times New Roman"/>
                 <w:noProof/>
                 <w:webHidden/>
-                <w:lang w:val="hr-HR"/>
               </w:rPr>
               <w:fldChar w:fldCharType="separate"/>
             </w:r>
             <w:r>
               <w:rPr>
-                <w:rFonts w:ascii="Times New Roman" w:hAnsi="Times New Roman" w:cs="Times New Roman"/>
                 <w:noProof/>
                 <w:webHidden/>
-                <w:lang w:val="hr-HR"/>
-              </w:rPr>
-              <w:t>13</w:t>
+              </w:rPr>
+              <w:t>14</w:t>
             </w:r>
             <w:r>
               <w:rPr>
-                <w:rFonts w:ascii="Times New Roman" w:hAnsi="Times New Roman" w:cs="Times New Roman"/>
                 <w:noProof/>
                 <w:webHidden/>
-                <w:lang w:val="hr-HR"/>
               </w:rPr>
               <w:fldChar w:fldCharType="end"/>
             </w:r>
@@ -1512,21 +1348,20 @@
               <w:tab w:val="right" w:leader="dot" w:pos="9016"/>
             </w:tabs>
             <w:rPr>
-              <w:rFonts w:ascii="Times New Roman" w:eastAsiaTheme="minorEastAsia" w:hAnsi="Times New Roman" w:cs="Times New Roman"/>
+              <w:rFonts w:eastAsiaTheme="minorEastAsia"/>
               <w:b w:val="0"/>
               <w:bCs w:val="0"/>
               <w:i w:val="0"/>
               <w:iCs w:val="0"/>
               <w:noProof/>
               <w:color w:val="auto"/>
-              <w:lang w:val="hr-HR" w:eastAsia="ja-JP"/>
+              <w:lang w:eastAsia="ja-JP"/>
             </w:rPr>
           </w:pPr>
-          <w:hyperlink w:anchor="_Toc225707080" w:history="1">
+          <w:hyperlink w:anchor="_Toc225952505" w:history="1">
             <w:r>
               <w:rPr>
                 <w:rStyle w:val="Hyperlink"/>
-                <w:rFonts w:ascii="Times New Roman" w:hAnsi="Times New Roman" w:cs="Times New Roman"/>
                 <w:noProof/>
                 <w:lang w:val="hr-HR"/>
               </w:rPr>
@@ -1534,63 +1369,49 @@
             </w:r>
             <w:r>
               <w:rPr>
-                <w:rFonts w:ascii="Times New Roman" w:hAnsi="Times New Roman" w:cs="Times New Roman"/>
                 <w:noProof/>
                 <w:webHidden/>
-                <w:lang w:val="hr-HR"/>
               </w:rPr>
               <w:tab/>
             </w:r>
             <w:r>
               <w:rPr>
-                <w:rFonts w:ascii="Times New Roman" w:hAnsi="Times New Roman" w:cs="Times New Roman"/>
                 <w:noProof/>
                 <w:webHidden/>
-                <w:lang w:val="hr-HR"/>
               </w:rPr>
               <w:fldChar w:fldCharType="begin"/>
             </w:r>
             <w:r>
               <w:rPr>
-                <w:rFonts w:ascii="Times New Roman" w:hAnsi="Times New Roman" w:cs="Times New Roman"/>
                 <w:noProof/>
                 <w:webHidden/>
-                <w:lang w:val="hr-HR"/>
-              </w:rPr>
-              <w:instrText xml:space="preserve"> PAGEREF _Toc225707080 \h </w:instrText>
+              </w:rPr>
+              <w:instrText xml:space="preserve"> PAGEREF _Toc225952505 \h </w:instrText>
             </w:r>
             <w:r>
               <w:rPr>
-                <w:rFonts w:ascii="Times New Roman" w:hAnsi="Times New Roman" w:cs="Times New Roman"/>
                 <w:noProof/>
                 <w:webHidden/>
-                <w:lang w:val="hr-HR"/>
               </w:rPr>
             </w:r>
             <w:r>
               <w:rPr>
-                <w:rFonts w:ascii="Times New Roman" w:hAnsi="Times New Roman" w:cs="Times New Roman"/>
                 <w:noProof/>
                 <w:webHidden/>
-                <w:lang w:val="hr-HR"/>
               </w:rPr>
               <w:fldChar w:fldCharType="separate"/>
             </w:r>
             <w:r>
               <w:rPr>
-                <w:rFonts w:ascii="Times New Roman" w:hAnsi="Times New Roman" w:cs="Times New Roman"/>
                 <w:noProof/>
                 <w:webHidden/>
-                <w:lang w:val="hr-HR"/>
-              </w:rPr>
-              <w:t>14</w:t>
+              </w:rPr>
+              <w:t>15</w:t>
             </w:r>
             <w:r>
               <w:rPr>
-                <w:rFonts w:ascii="Times New Roman" w:hAnsi="Times New Roman" w:cs="Times New Roman"/>
                 <w:noProof/>
                 <w:webHidden/>
-                <w:lang w:val="hr-HR"/>
               </w:rPr>
               <w:fldChar w:fldCharType="end"/>
             </w:r>
@@ -1603,21 +1424,20 @@
               <w:tab w:val="right" w:leader="dot" w:pos="9016"/>
             </w:tabs>
             <w:rPr>
-              <w:rFonts w:ascii="Times New Roman" w:eastAsiaTheme="minorEastAsia" w:hAnsi="Times New Roman" w:cs="Times New Roman"/>
+              <w:rFonts w:eastAsiaTheme="minorEastAsia"/>
               <w:b w:val="0"/>
               <w:bCs w:val="0"/>
               <w:i w:val="0"/>
               <w:iCs w:val="0"/>
               <w:noProof/>
               <w:color w:val="auto"/>
-              <w:lang w:val="hr-HR" w:eastAsia="ja-JP"/>
+              <w:lang w:eastAsia="ja-JP"/>
             </w:rPr>
           </w:pPr>
-          <w:hyperlink w:anchor="_Toc225707081" w:history="1">
+          <w:hyperlink w:anchor="_Toc225952506" w:history="1">
             <w:r>
               <w:rPr>
                 <w:rStyle w:val="Hyperlink"/>
-                <w:rFonts w:ascii="Times New Roman" w:hAnsi="Times New Roman" w:cs="Times New Roman"/>
                 <w:noProof/>
                 <w:lang w:val="hr-HR"/>
               </w:rPr>
@@ -1625,63 +1445,49 @@
             </w:r>
             <w:r>
               <w:rPr>
-                <w:rFonts w:ascii="Times New Roman" w:hAnsi="Times New Roman" w:cs="Times New Roman"/>
                 <w:noProof/>
                 <w:webHidden/>
-                <w:lang w:val="hr-HR"/>
               </w:rPr>
               <w:tab/>
             </w:r>
             <w:r>
               <w:rPr>
-                <w:rFonts w:ascii="Times New Roman" w:hAnsi="Times New Roman" w:cs="Times New Roman"/>
                 <w:noProof/>
                 <w:webHidden/>
-                <w:lang w:val="hr-HR"/>
               </w:rPr>
               <w:fldChar w:fldCharType="begin"/>
             </w:r>
             <w:r>
               <w:rPr>
-                <w:rFonts w:ascii="Times New Roman" w:hAnsi="Times New Roman" w:cs="Times New Roman"/>
                 <w:noProof/>
                 <w:webHidden/>
-                <w:lang w:val="hr-HR"/>
-              </w:rPr>
-              <w:instrText xml:space="preserve"> PAGEREF _Toc225707081 \h </w:instrText>
+              </w:rPr>
+              <w:instrText xml:space="preserve"> PAGEREF _Toc225952506 \h </w:instrText>
             </w:r>
             <w:r>
               <w:rPr>
-                <w:rFonts w:ascii="Times New Roman" w:hAnsi="Times New Roman" w:cs="Times New Roman"/>
                 <w:noProof/>
                 <w:webHidden/>
-                <w:lang w:val="hr-HR"/>
               </w:rPr>
             </w:r>
             <w:r>
               <w:rPr>
-                <w:rFonts w:ascii="Times New Roman" w:hAnsi="Times New Roman" w:cs="Times New Roman"/>
                 <w:noProof/>
                 <w:webHidden/>
-                <w:lang w:val="hr-HR"/>
               </w:rPr>
               <w:fldChar w:fldCharType="separate"/>
             </w:r>
             <w:r>
               <w:rPr>
-                <w:rFonts w:ascii="Times New Roman" w:hAnsi="Times New Roman" w:cs="Times New Roman"/>
                 <w:noProof/>
                 <w:webHidden/>
-                <w:lang w:val="hr-HR"/>
-              </w:rPr>
-              <w:t>15</w:t>
+              </w:rPr>
+              <w:t>16</w:t>
             </w:r>
             <w:r>
               <w:rPr>
-                <w:rFonts w:ascii="Times New Roman" w:hAnsi="Times New Roman" w:cs="Times New Roman"/>
                 <w:noProof/>
                 <w:webHidden/>
-                <w:lang w:val="hr-HR"/>
               </w:rPr>
               <w:fldChar w:fldCharType="end"/>
             </w:r>
@@ -1694,21 +1500,20 @@
               <w:tab w:val="right" w:leader="dot" w:pos="9016"/>
             </w:tabs>
             <w:rPr>
-              <w:rFonts w:ascii="Times New Roman" w:eastAsiaTheme="minorEastAsia" w:hAnsi="Times New Roman" w:cs="Times New Roman"/>
+              <w:rFonts w:eastAsiaTheme="minorEastAsia"/>
               <w:b w:val="0"/>
               <w:bCs w:val="0"/>
               <w:i w:val="0"/>
               <w:iCs w:val="0"/>
               <w:noProof/>
               <w:color w:val="auto"/>
-              <w:lang w:val="hr-HR" w:eastAsia="ja-JP"/>
+              <w:lang w:eastAsia="ja-JP"/>
             </w:rPr>
           </w:pPr>
-          <w:hyperlink w:anchor="_Toc225707082" w:history="1">
+          <w:hyperlink w:anchor="_Toc225952507" w:history="1">
             <w:r>
               <w:rPr>
                 <w:rStyle w:val="Hyperlink"/>
-                <w:rFonts w:ascii="Times New Roman" w:hAnsi="Times New Roman" w:cs="Times New Roman"/>
                 <w:noProof/>
                 <w:lang w:val="hr-HR"/>
               </w:rPr>
@@ -1716,63 +1521,49 @@
             </w:r>
             <w:r>
               <w:rPr>
-                <w:rFonts w:ascii="Times New Roman" w:hAnsi="Times New Roman" w:cs="Times New Roman"/>
                 <w:noProof/>
                 <w:webHidden/>
-                <w:lang w:val="hr-HR"/>
               </w:rPr>
               <w:tab/>
             </w:r>
             <w:r>
               <w:rPr>
-                <w:rFonts w:ascii="Times New Roman" w:hAnsi="Times New Roman" w:cs="Times New Roman"/>
                 <w:noProof/>
                 <w:webHidden/>
-                <w:lang w:val="hr-HR"/>
               </w:rPr>
               <w:fldChar w:fldCharType="begin"/>
             </w:r>
             <w:r>
               <w:rPr>
-                <w:rFonts w:ascii="Times New Roman" w:hAnsi="Times New Roman" w:cs="Times New Roman"/>
                 <w:noProof/>
                 <w:webHidden/>
-                <w:lang w:val="hr-HR"/>
-              </w:rPr>
-              <w:instrText xml:space="preserve"> PAGEREF _Toc225707082 \h </w:instrText>
+              </w:rPr>
+              <w:instrText xml:space="preserve"> PAGEREF _Toc225952507 \h </w:instrText>
             </w:r>
             <w:r>
               <w:rPr>
-                <w:rFonts w:ascii="Times New Roman" w:hAnsi="Times New Roman" w:cs="Times New Roman"/>
                 <w:noProof/>
                 <w:webHidden/>
-                <w:lang w:val="hr-HR"/>
               </w:rPr>
             </w:r>
             <w:r>
               <w:rPr>
-                <w:rFonts w:ascii="Times New Roman" w:hAnsi="Times New Roman" w:cs="Times New Roman"/>
                 <w:noProof/>
                 <w:webHidden/>
-                <w:lang w:val="hr-HR"/>
               </w:rPr>
               <w:fldChar w:fldCharType="separate"/>
             </w:r>
             <w:r>
               <w:rPr>
-                <w:rFonts w:ascii="Times New Roman" w:hAnsi="Times New Roman" w:cs="Times New Roman"/>
                 <w:noProof/>
                 <w:webHidden/>
-                <w:lang w:val="hr-HR"/>
-              </w:rPr>
-              <w:t>16</w:t>
+              </w:rPr>
+              <w:t>17</w:t>
             </w:r>
             <w:r>
               <w:rPr>
-                <w:rFonts w:ascii="Times New Roman" w:hAnsi="Times New Roman" w:cs="Times New Roman"/>
                 <w:noProof/>
                 <w:webHidden/>
-                <w:lang w:val="hr-HR"/>
               </w:rPr>
               <w:fldChar w:fldCharType="end"/>
             </w:r>
@@ -1821,7 +1612,7 @@
           <w:lang w:val="hr-HR"/>
         </w:rPr>
       </w:pPr>
-      <w:bookmarkStart w:id="1" w:name="_Toc225707070"/>
+      <w:bookmarkStart w:id="1" w:name="_Toc225952495"/>
       <w:r>
         <w:rPr>
           <w:lang w:val="hr-HR"/>
@@ -1865,7 +1656,7 @@
           <w:lang w:val="hr-HR"/>
         </w:rPr>
       </w:pPr>
-      <w:bookmarkStart w:id="2" w:name="_Toc225707071"/>
+      <w:bookmarkStart w:id="2" w:name="_Toc225952496"/>
       <w:r>
         <w:rPr>
           <w:lang w:val="hr-HR"/>
@@ -2693,7 +2484,19 @@
         <w:rPr>
           <w:lang w:val="hr-HR"/>
         </w:rPr>
-        <w:t xml:space="preserve">Cilj rada je napraviti vlastiti simplektički integrator po uzoru na </w:t>
+        <w:t xml:space="preserve">Cilj rada napraviti </w:t>
+      </w:r>
+      <w:r>
+        <w:rPr>
+          <w:lang w:val="hr-HR"/>
+        </w:rPr>
+        <w:t xml:space="preserve">je </w:t>
+      </w:r>
+      <w:r>
+        <w:rPr>
+          <w:lang w:val="hr-HR"/>
+        </w:rPr>
+        <w:t xml:space="preserve">vlastiti simplektički integrator po uzoru na </w:t>
       </w:r>
       <w:r>
         <w:rPr>
@@ -2865,7 +2668,7 @@
           <w:lang w:val="hr-HR"/>
         </w:rPr>
       </w:pPr>
-      <w:bookmarkStart w:id="3" w:name="_Toc225707072"/>
+      <w:bookmarkStart w:id="3" w:name="_Toc225952497"/>
       <w:r>
         <w:rPr>
           <w:lang w:val="hr-HR"/>
@@ -3012,7 +2815,7 @@
           <w:lang w:val="hr-HR"/>
         </w:rPr>
       </w:pPr>
-      <w:bookmarkStart w:id="4" w:name="_Toc225707073"/>
+      <w:bookmarkStart w:id="4" w:name="_Toc225952498"/>
       <w:r>
         <w:rPr>
           <w:lang w:val="hr-HR"/>
@@ -3027,6 +2830,13 @@
           <w:lang w:val="hr-HR"/>
         </w:rPr>
       </w:pPr>
+    </w:p>
+    <w:p>
+      <w:pPr>
+        <w:rPr>
+          <w:lang w:val="hr-HR"/>
+        </w:rPr>
+      </w:pPr>
       <w:r>
         <w:rPr>
           <w:lang w:val="hr-HR"/>
@@ -3085,7 +2895,25 @@
         <w:rPr>
           <w:lang w:val="hr-HR"/>
         </w:rPr>
-        <w:t>Kako bih mogla provoditi dugoročne simulacije s integratorom N tijela te pratiti temperaturu planeta, potrebne su mi određene informacije za sustav zvijezda i za planetarni sustav</w:t>
+        <w:t xml:space="preserve">Kako bih mogla provoditi dugoročne simulacije s integratorom N tijela te pratiti temperaturu planeta, potrebne su mi </w:t>
+      </w:r>
+      <w:r>
+        <w:rPr>
+          <w:lang w:val="hr-HR"/>
+        </w:rPr>
+        <w:t>sljede</w:t>
+      </w:r>
+      <w:r>
+        <w:rPr>
+          <w:lang w:val="hr-HR" w:eastAsia="ja-JP"/>
+        </w:rPr>
+        <w:t>će</w:t>
+      </w:r>
+      <w:r>
+        <w:rPr>
+          <w:lang w:val="hr-HR"/>
+        </w:rPr>
+        <w:t xml:space="preserve"> informacije za sustav zvijezda i za planetarni sustav</w:t>
       </w:r>
       <w:r>
         <w:rPr>
@@ -3363,13 +3191,25 @@
         <w:rPr>
           <w:lang w:val="hr-HR"/>
         </w:rPr>
-        <w:t xml:space="preserve">prikazani su svi potrebni podaci za integraciju. </w:t>
-      </w:r>
-      <w:r>
-        <w:rPr>
-          <w:lang w:val="hr-HR"/>
-        </w:rPr>
-        <w:t xml:space="preserve">Važno je napomenuti kako su ovakvi sustavi izrazito teški za opažati i izmjeriti orbitalne elemente, stoga mnogo izvora imaju različite vrijednosti ili nemaju jednostavno podatke za određene sustave. Tijekom potrage za informacijama, morala sam izbaciti 7 sustava zbog nedostatka informacija ili prevelikih nekonzistentnosti u literaturi. </w:t>
+        <w:t>prikazani su svi potrebni podaci za integraciju</w:t>
+      </w:r>
+      <w:r>
+        <w:rPr>
+          <w:lang w:val="hr-HR"/>
+        </w:rPr>
+        <w:t xml:space="preserve"> za 5 izabrana sustava</w:t>
+      </w:r>
+      <w:r>
+        <w:rPr>
+          <w:lang w:val="hr-HR"/>
+        </w:rPr>
+        <w:t xml:space="preserve">. </w:t>
+      </w:r>
+      <w:r>
+        <w:rPr>
+          <w:lang w:val="hr-HR"/>
+        </w:rPr>
+        <w:t xml:space="preserve">Važno je napomenuti kako su ovakvi sustavi izrazito teški za opažati i izmjeriti orbitalne elemente, stoga mnogo izvora imaju različite vrijednosti ili nemaju jednostavno podatke za određene sustave. Tijekom potrage za informacijama, morala sam izbaciti  sustava zbog nedostatka informacija ili prevelikih nekonzistentnosti u literaturi. </w:t>
       </w:r>
       <w:r>
         <w:rPr>
@@ -3415,6 +3255,45 @@
         </w:rPr>
         <w:t xml:space="preserve"> prikazani su podaci svih egzoplaneta preuzetih s NASA Exoplanet Archive.</w:t>
       </w:r>
+      <w:r>
+        <w:rPr>
+          <w:lang w:val="hr-HR"/>
+        </w:rPr>
+        <w:t xml:space="preserve"> Zanimljivo je opažanje da </w:t>
+      </w:r>
+      <w:r>
+        <w:rPr>
+          <w:i/>
+          <w:iCs/>
+          <w:lang w:val="hr-HR"/>
+        </w:rPr>
+        <w:t>svaki egzoplanetarni sustav ima egzoplanete oko komponente koja nije binarna</w:t>
+      </w:r>
+      <w:r>
+        <w:rPr>
+          <w:lang w:val="hr-HR"/>
+        </w:rPr>
+        <w:t xml:space="preserve">, gdje je jedina iznimka Gliese 900, no taj </w:t>
+      </w:r>
+      <w:r>
+        <w:rPr>
+          <w:lang w:val="hr-HR"/>
+        </w:rPr>
+        <w:lastRenderedPageBreak/>
+        <w:t>sustav je jedini otkriveni sustav gdje planet kruži oko sve tri zvijezde</w:t>
+      </w:r>
+      <w:r>
+        <w:rPr>
+          <w:lang w:val="hr-HR"/>
+        </w:rPr>
+        <w:t xml:space="preserve"> i to na udaljenosti od 12000 AU. </w:t>
+      </w:r>
+      <w:r>
+        <w:rPr>
+          <w:lang w:val="hr-HR"/>
+        </w:rPr>
+        <w:t>Iz ovog razloga, fokusirat ću se samo na istraživanje mogućnosti habitabilnosti oko matične zvijezde.</w:t>
+      </w:r>
     </w:p>
     <w:p>
       <w:pPr>
@@ -3433,20 +3312,79 @@
         <w:rPr>
           <w:lang w:val="hr-HR"/>
         </w:rPr>
-        <w:lastRenderedPageBreak/>
-        <w:t xml:space="preserve">Iako nisu poznati svi orbitalni elementi ovih sustava triju zvijezda, </w:t>
-      </w:r>
-      <w:r>
-        <w:rPr>
-          <w:lang w:val="hr-HR"/>
-        </w:rPr>
-        <w:t xml:space="preserve">ideja ovoga rada je onda istražiti limitacije u podacima te pogledati dugoročnu habitabilnost sustava za različite vrijednosti ekscentriciteta, inklinacije i drugih parametara, osobito udaljenije zvijezde zbog razvitka Kozai-Lidov mehanizma. </w:t>
-      </w:r>
-      <w:r>
-        <w:rPr>
-          <w:lang w:val="hr-HR"/>
-        </w:rPr>
-        <w:t xml:space="preserve">Budući da nemamo još izmjerene podatke za te vrijednosti u literaturi, vrijedi istražiti čitav raspon vrijednosti te kako one utječu na habitabilnost egzoplaneta za dugi niz godina, otprilike 10 milijuna godina. </w:t>
+        <w:t>Ova 5 specifična sustava izabrana su s razlogom. Prva dva, Gliese 667 i LTT 1445 jedini su sustavu triju zvijezda koji imaju barem jedan egzoplanet u habitabilnoj zoni, a da je terestrički</w:t>
+      </w:r>
+      <w:r>
+        <w:rPr>
+          <w:lang w:val="hr-HR"/>
+        </w:rPr>
+        <w:t>. Sustav 94 Ceti je zanimljiv zato što je zvijezda A matična zvijezda egzoplanetima,</w:t>
+      </w:r>
+      <w:r>
+        <w:rPr>
+          <w:lang w:val="hr-HR"/>
+        </w:rPr>
+        <w:t xml:space="preserve"> a njezina udaljenija komponenta je binarni sustav koji je izrazito blizak jedan drugom, samo 0.98 AU. </w:t>
+      </w:r>
+      <w:r>
+        <w:rPr>
+          <w:lang w:val="hr-HR"/>
+        </w:rPr>
+        <w:t xml:space="preserve">Kepler-444 </w:t>
+      </w:r>
+      <w:r>
+        <w:rPr>
+          <w:lang w:val="hr-HR"/>
+        </w:rPr>
+        <w:t xml:space="preserve">je najstariji otkriveni egzoplanetarni sustav, </w:t>
+      </w:r>
+      <w:r>
+        <w:rPr>
+          <w:lang w:val="hr-HR"/>
+        </w:rPr>
+        <w:t>ali treća zvijezda je vrlo bliska</w:t>
+      </w:r>
+      <w:r>
+        <w:rPr>
+          <w:lang w:val="hr-HR"/>
+        </w:rPr>
+        <w:t xml:space="preserve">, samo na udaljenosti od 52.2 AU što čini ovaj sustav s mnogo egzoplaneta zanimljivim za istražiti. </w:t>
+      </w:r>
+      <w:r>
+        <w:rPr>
+          <w:lang w:val="hr-HR"/>
+        </w:rPr>
+        <w:t xml:space="preserve">Konačno, HD 132563 je zanimljiv </w:t>
+      </w:r>
+      <w:r>
+        <w:rPr>
+          <w:lang w:val="hr-HR"/>
+        </w:rPr>
+        <w:t>zato što unutarnji binarni sustav ima izrazito ekscentričnu orbitu, što može poja</w:t>
+      </w:r>
+      <w:r>
+        <w:rPr>
+          <w:lang w:val="hr-HR"/>
+        </w:rPr>
+        <w:t>č</w:t>
+      </w:r>
+      <w:r>
+        <w:rPr>
+          <w:lang w:val="hr-HR"/>
+        </w:rPr>
+        <w:t xml:space="preserve">ati Kozai-Lidov mehanizme i utjecati na habitabilnost egzoplaneta na zvijezdi C. </w:t>
+      </w:r>
+      <w:r>
+        <w:rPr>
+          <w:lang w:val="hr-HR"/>
+        </w:rPr>
+        <w:t>Svaki sustav bih integrirala na 100,000 godina radi ograničenosti računalne moći</w:t>
+      </w:r>
+      <w:r>
+        <w:rPr>
+          <w:lang w:val="hr-HR"/>
+        </w:rPr>
+        <w:t xml:space="preserve"> te spremila sveukupno 10,000 iteracija, što daje detaljni pregled trendova i ciklusa raznih orbitalnih vrijednosti. </w:t>
       </w:r>
     </w:p>
     <w:p>
@@ -3529,9 +3467,9 @@
           <w:lang w:val="hr-HR"/>
         </w:rPr>
         <w:drawing>
-          <wp:inline distT="0" distB="0" distL="0" distR="0" wp14:anchorId="00CD2634" wp14:editId="7CC6AA29">
-            <wp:extent cx="4376692" cy="3144419"/>
-            <wp:effectExtent l="0" t="0" r="5080" b="5715"/>
+          <wp:inline distT="0" distB="0" distL="0" distR="0" wp14:anchorId="00CD2634" wp14:editId="5EE275E8">
+            <wp:extent cx="4375948" cy="1723001"/>
+            <wp:effectExtent l="0" t="0" r="5715" b="4445"/>
             <wp:docPr id="119907485" name="Picture 3" descr="A table with numbers and letters&#10;&#10;AI-generated content may be incorrect."/>
             <wp:cNvGraphicFramePr>
               <a:graphicFrameLocks xmlns:a="http://schemas.openxmlformats.org/drawingml/2006/main" noChangeAspect="1"/>
@@ -3543,8 +3481,131 @@
                     <pic:cNvPr id="119907485" name="Picture 3" descr="A table with numbers and letters&#10;&#10;AI-generated content may be incorrect."/>
                     <pic:cNvPicPr/>
                   </pic:nvPicPr>
+                  <pic:blipFill rotWithShape="1">
+                    <a:blip r:embed="rId8">
+                      <a:extLst>
+                        <a:ext uri="{28A0092B-C50C-407E-A947-70E740481C1C}">
+                          <a14:useLocalDpi xmlns:a14="http://schemas.microsoft.com/office/drawing/2010/main" val="0"/>
+                        </a:ext>
+                      </a:extLst>
+                    </a:blip>
+                    <a:srcRect b="45195"/>
+                    <a:stretch>
+                      <a:fillRect/>
+                    </a:stretch>
+                  </pic:blipFill>
+                  <pic:spPr bwMode="auto">
+                    <a:xfrm>
+                      <a:off x="0" y="0"/>
+                      <a:ext cx="4397732" cy="1731579"/>
+                    </a:xfrm>
+                    <a:prstGeom prst="rect">
+                      <a:avLst/>
+                    </a:prstGeom>
+                    <a:ln>
+                      <a:noFill/>
+                    </a:ln>
+                    <a:extLst>
+                      <a:ext uri="{53640926-AAD7-44D8-BBD7-CCE9431645EC}">
+                        <a14:shadowObscured xmlns:a14="http://schemas.microsoft.com/office/drawing/2010/main"/>
+                      </a:ext>
+                    </a:extLst>
+                  </pic:spPr>
+                </pic:pic>
+              </a:graphicData>
+            </a:graphic>
+          </wp:inline>
+        </w:drawing>
+      </w:r>
+    </w:p>
+    <w:p>
+      <w:pPr>
+        <w:rPr>
+          <w:lang w:val="hr-HR"/>
+        </w:rPr>
+      </w:pPr>
+    </w:p>
+    <w:p>
+      <w:pPr>
+        <w:pStyle w:val="Caption"/>
+        <w:jc w:val="center"/>
+        <w:rPr>
+          <w:lang w:val="hr-HR"/>
+        </w:rPr>
+      </w:pPr>
+      <w:r>
+        <w:rPr>
+          <w:lang w:val="hr-HR"/>
+        </w:rPr>
+        <w:t xml:space="preserve">Tablica </w:t>
+      </w:r>
+      <w:r>
+        <w:rPr>
+          <w:lang w:val="hr-HR"/>
+        </w:rPr>
+        <w:fldChar w:fldCharType="begin"/>
+      </w:r>
+      <w:r>
+        <w:rPr>
+          <w:lang w:val="hr-HR"/>
+        </w:rPr>
+        <w:instrText xml:space="preserve"> SEQ Tablica \* ARABIC </w:instrText>
+      </w:r>
+      <w:r>
+        <w:rPr>
+          <w:lang w:val="hr-HR"/>
+        </w:rPr>
+        <w:fldChar w:fldCharType="separate"/>
+      </w:r>
+      <w:r>
+        <w:rPr>
+          <w:noProof/>
+          <w:lang w:val="hr-HR"/>
+        </w:rPr>
+        <w:t>2</w:t>
+      </w:r>
+      <w:r>
+        <w:rPr>
+          <w:lang w:val="hr-HR"/>
+        </w:rPr>
+        <w:fldChar w:fldCharType="end"/>
+      </w:r>
+      <w:r>
+        <w:rPr>
+          <w:lang w:val="hr-HR"/>
+        </w:rPr>
+        <w:t>: mase, radijusi, efektivna temperatura i spektralni tip svake komponente sustava triju zvijezda.</w:t>
+      </w:r>
+    </w:p>
+    <w:p>
+      <w:pPr>
+        <w:jc w:val="center"/>
+        <w:rPr>
+          <w:lang w:val="hr-HR"/>
+        </w:rPr>
+      </w:pPr>
+      <w:r>
+        <w:rPr>
+          <w:noProof/>
+          <w:lang w:val="hr-HR"/>
+        </w:rPr>
+        <w:drawing>
+          <wp:inline distT="0" distB="0" distL="0" distR="0" wp14:anchorId="1C52AA8D" wp14:editId="28A6DD69">
+            <wp:extent cx="5731510" cy="1337310"/>
+            <wp:effectExtent l="0" t="0" r="0" b="0"/>
+            <wp:docPr id="89097467" name="Picture 1"/>
+            <wp:cNvGraphicFramePr>
+              <a:graphicFrameLocks xmlns:a="http://schemas.openxmlformats.org/drawingml/2006/main" noChangeAspect="1"/>
+            </wp:cNvGraphicFramePr>
+            <a:graphic xmlns:a="http://schemas.openxmlformats.org/drawingml/2006/main">
+              <a:graphicData uri="http://schemas.openxmlformats.org/drawingml/2006/picture">
+                <pic:pic xmlns:pic="http://schemas.openxmlformats.org/drawingml/2006/picture">
+                  <pic:nvPicPr>
+                    <pic:cNvPr id="89097467" name="Picture 89097467"/>
+                    <pic:cNvPicPr/>
+                  </pic:nvPicPr>
                   <pic:blipFill>
-                    <a:blip r:embed="rId8">
+                    <a:blip r:embed="rId9" cstate="print">
                       <a:extLst>
                         <a:ext uri="{28A0092B-C50C-407E-A947-70E740481C1C}">
                           <a14:useLocalDpi xmlns:a14="http://schemas.microsoft.com/office/drawing/2010/main" val="0"/>
@@ -3558,7 +3619,7 @@
                   <pic:spPr>
                     <a:xfrm>
                       <a:off x="0" y="0"/>
-                      <a:ext cx="4397733" cy="3159536"/>
+                      <a:ext cx="5731510" cy="1337310"/>
                     </a:xfrm>
                     <a:prstGeom prst="rect">
                       <a:avLst/>
@@ -3573,6 +3634,7 @@
     </w:p>
     <w:p>
       <w:pPr>
+        <w:jc w:val="center"/>
         <w:rPr>
           <w:lang w:val="hr-HR"/>
         </w:rPr>
@@ -3580,14 +3642,65 @@
     </w:p>
     <w:p>
       <w:pPr>
-        <w:rPr>
-          <w:lang w:val="hr-HR"/>
-        </w:rPr>
-      </w:pPr>
+        <w:pStyle w:val="Caption"/>
+        <w:keepNext/>
+        <w:jc w:val="center"/>
+        <w:rPr>
+          <w:lang w:val="hr-HR"/>
+        </w:rPr>
+      </w:pPr>
+      <w:r>
+        <w:rPr>
+          <w:lang w:val="hr-HR"/>
+        </w:rPr>
+        <w:t xml:space="preserve">Tablica </w:t>
+      </w:r>
+      <w:r>
+        <w:rPr>
+          <w:lang w:val="hr-HR"/>
+        </w:rPr>
+        <w:fldChar w:fldCharType="begin"/>
+      </w:r>
+      <w:r>
+        <w:rPr>
+          <w:lang w:val="hr-HR"/>
+        </w:rPr>
+        <w:instrText xml:space="preserve"> SEQ Tablica \* ARABIC </w:instrText>
+      </w:r>
+      <w:r>
+        <w:rPr>
+          <w:lang w:val="hr-HR"/>
+        </w:rPr>
+        <w:fldChar w:fldCharType="separate"/>
+      </w:r>
+      <w:r>
+        <w:rPr>
+          <w:noProof/>
+          <w:lang w:val="hr-HR"/>
+        </w:rPr>
+        <w:t>3</w:t>
+      </w:r>
+      <w:r>
+        <w:rPr>
+          <w:lang w:val="hr-HR"/>
+        </w:rPr>
+        <w:fldChar w:fldCharType="end"/>
+      </w:r>
+      <w:r>
+        <w:rPr>
+          <w:lang w:val="hr-HR"/>
+        </w:rPr>
+        <w:t>: orbitalni podaci unutarnjeg sustava i udaljenije komponente te izvori svih podataka</w:t>
+      </w:r>
+      <w:r>
+        <w:rPr>
+          <w:lang w:val="hr-HR"/>
+        </w:rPr>
+        <w:t>.</w:t>
+      </w:r>
     </w:p>
     <w:p>
       <w:pPr>
-        <w:pStyle w:val="Caption"/>
         <w:jc w:val="center"/>
         <w:rPr>
           <w:lang w:val="hr-HR"/>
@@ -3595,65 +3708,14 @@
       </w:pPr>
       <w:r>
         <w:rPr>
-          <w:lang w:val="hr-HR"/>
-        </w:rPr>
-        <w:t xml:space="preserve">Tablica </w:t>
-      </w:r>
-      <w:r>
-        <w:rPr>
-          <w:lang w:val="hr-HR"/>
-        </w:rPr>
-        <w:fldChar w:fldCharType="begin"/>
-      </w:r>
-      <w:r>
-        <w:rPr>
-          <w:lang w:val="hr-HR"/>
-        </w:rPr>
-        <w:instrText xml:space="preserve"> SEQ Tablica \* ARABIC </w:instrText>
-      </w:r>
-      <w:r>
-        <w:rPr>
-          <w:lang w:val="hr-HR"/>
-        </w:rPr>
-        <w:fldChar w:fldCharType="separate"/>
-      </w:r>
-      <w:r>
-        <w:rPr>
           <w:noProof/>
           <w:lang w:val="hr-HR"/>
         </w:rPr>
-        <w:t>2</w:t>
-      </w:r>
-      <w:r>
-        <w:rPr>
-          <w:lang w:val="hr-HR"/>
-        </w:rPr>
-        <w:fldChar w:fldCharType="end"/>
-      </w:r>
-      <w:r>
-        <w:rPr>
-          <w:lang w:val="hr-HR"/>
-        </w:rPr>
-        <w:t>: mase, radijusi, efektivna temperatura i spektralni tip svake komponente sustava triju zvijezda.</w:t>
-      </w:r>
-    </w:p>
-    <w:p>
-      <w:pPr>
-        <w:jc w:val="center"/>
-        <w:rPr>
-          <w:lang w:val="hr-HR"/>
-        </w:rPr>
-      </w:pPr>
-      <w:r>
-        <w:rPr>
-          <w:noProof/>
-          <w:lang w:val="hr-HR"/>
-        </w:rPr>
         <w:drawing>
-          <wp:inline distT="0" distB="0" distL="0" distR="0" wp14:anchorId="0F5324B5" wp14:editId="2472DD00">
-            <wp:extent cx="5731510" cy="2417445"/>
-            <wp:effectExtent l="0" t="0" r="0" b="0"/>
-            <wp:docPr id="1403003216" name="Picture 6" descr="A screenshot of a table&#10;&#10;AI-generated content may be incorrect."/>
+          <wp:inline distT="0" distB="0" distL="0" distR="0" wp14:anchorId="630AF75B" wp14:editId="028AB087">
+            <wp:extent cx="5731510" cy="1163781"/>
+            <wp:effectExtent l="0" t="0" r="0" b="5080"/>
+            <wp:docPr id="53540156" name="Picture 8" descr="A screenshot of a computer&#10;&#10;AI-generated content may be incorrect."/>
             <wp:cNvGraphicFramePr>
               <a:graphicFrameLocks xmlns:a="http://schemas.openxmlformats.org/drawingml/2006/main" noChangeAspect="1"/>
             </wp:cNvGraphicFramePr>
@@ -3661,11 +3723,161 @@
               <a:graphicData uri="http://schemas.openxmlformats.org/drawingml/2006/picture">
                 <pic:pic xmlns:pic="http://schemas.openxmlformats.org/drawingml/2006/picture">
                   <pic:nvPicPr>
-                    <pic:cNvPr id="1403003216" name="Picture 6" descr="A screenshot of a table&#10;&#10;AI-generated content may be incorrect."/>
+                    <pic:cNvPr id="53540156" name="Picture 8" descr="A screenshot of a computer&#10;&#10;AI-generated content may be incorrect."/>
+                    <pic:cNvPicPr/>
+                  </pic:nvPicPr>
+                  <pic:blipFill rotWithShape="1">
+                    <a:blip r:embed="rId10">
+                      <a:extLst>
+                        <a:ext uri="{28A0092B-C50C-407E-A947-70E740481C1C}">
+                          <a14:useLocalDpi xmlns:a14="http://schemas.microsoft.com/office/drawing/2010/main" val="0"/>
+                        </a:ext>
+                      </a:extLst>
+                    </a:blip>
+                    <a:srcRect b="45584"/>
+                    <a:stretch>
+                      <a:fillRect/>
+                    </a:stretch>
+                  </pic:blipFill>
+                  <pic:spPr bwMode="auto">
+                    <a:xfrm>
+                      <a:off x="0" y="0"/>
+                      <a:ext cx="5731510" cy="1163781"/>
+                    </a:xfrm>
+                    <a:prstGeom prst="rect">
+                      <a:avLst/>
+                    </a:prstGeom>
+                    <a:ln>
+                      <a:noFill/>
+                    </a:ln>
+                    <a:extLst>
+                      <a:ext uri="{53640926-AAD7-44D8-BBD7-CCE9431645EC}">
+                        <a14:shadowObscured xmlns:a14="http://schemas.microsoft.com/office/drawing/2010/main"/>
+                      </a:ext>
+                    </a:extLst>
+                  </pic:spPr>
+                </pic:pic>
+              </a:graphicData>
+            </a:graphic>
+          </wp:inline>
+        </w:drawing>
+      </w:r>
+    </w:p>
+    <w:p>
+      <w:pPr>
+        <w:rPr>
+          <w:lang w:val="hr-HR"/>
+        </w:rPr>
+      </w:pPr>
+    </w:p>
+    <w:p>
+      <w:pPr>
+        <w:pStyle w:val="Caption"/>
+        <w:jc w:val="center"/>
+        <w:rPr>
+          <w:lang w:val="hr-HR"/>
+        </w:rPr>
+      </w:pPr>
+    </w:p>
+    <w:p>
+      <w:pPr>
+        <w:pStyle w:val="Caption"/>
+        <w:jc w:val="center"/>
+        <w:rPr>
+          <w:lang w:val="hr-HR"/>
+        </w:rPr>
+      </w:pPr>
+    </w:p>
+    <w:p>
+      <w:pPr>
+        <w:pStyle w:val="Caption"/>
+        <w:jc w:val="center"/>
+        <w:rPr>
+          <w:lang w:val="hr-HR"/>
+        </w:rPr>
+      </w:pPr>
+    </w:p>
+    <w:p>
+      <w:pPr>
+        <w:pStyle w:val="Caption"/>
+        <w:jc w:val="center"/>
+        <w:rPr>
+          <w:lang w:val="hr-HR"/>
+        </w:rPr>
+      </w:pPr>
+      <w:r>
+        <w:rPr>
+          <w:lang w:val="hr-HR"/>
+        </w:rPr>
+        <w:t xml:space="preserve">Tablica </w:t>
+      </w:r>
+      <w:r>
+        <w:rPr>
+          <w:lang w:val="hr-HR"/>
+        </w:rPr>
+        <w:fldChar w:fldCharType="begin"/>
+      </w:r>
+      <w:r>
+        <w:rPr>
+          <w:lang w:val="hr-HR"/>
+        </w:rPr>
+        <w:instrText xml:space="preserve"> SEQ Tablica \* ARABIC </w:instrText>
+      </w:r>
+      <w:r>
+        <w:rPr>
+          <w:lang w:val="hr-HR"/>
+        </w:rPr>
+        <w:fldChar w:fldCharType="separate"/>
+      </w:r>
+      <w:r>
+        <w:rPr>
+          <w:noProof/>
+          <w:lang w:val="hr-HR"/>
+        </w:rPr>
+        <w:t>4</w:t>
+      </w:r>
+      <w:r>
+        <w:rPr>
+          <w:lang w:val="hr-HR"/>
+        </w:rPr>
+        <w:fldChar w:fldCharType="end"/>
+      </w:r>
+      <w:r>
+        <w:rPr>
+          <w:lang w:val="hr-HR"/>
+        </w:rPr>
+        <w:t>: orbitalni period, velika poluos staze, radijus i masa planeta, ekscentricitet te temperatura planeta unutar egzoplanetarnih sustava odabranih sustava triju zvijezda.</w:t>
+      </w:r>
+    </w:p>
+    <w:p>
+      <w:pPr>
+        <w:jc w:val="center"/>
+        <w:rPr>
+          <w:lang w:val="hr-HR"/>
+        </w:rPr>
+      </w:pPr>
+      <w:r>
+        <w:rPr>
+          <w:noProof/>
+          <w:lang w:val="hr-HR"/>
+        </w:rPr>
+        <w:drawing>
+          <wp:inline distT="0" distB="0" distL="0" distR="0" wp14:anchorId="50C88A44" wp14:editId="0C6E1CD4">
+            <wp:extent cx="4783597" cy="3318733"/>
+            <wp:effectExtent l="0" t="0" r="4445" b="0"/>
+            <wp:docPr id="340405106" name="Picture 2"/>
+            <wp:cNvGraphicFramePr>
+              <a:graphicFrameLocks xmlns:a="http://schemas.openxmlformats.org/drawingml/2006/main" noChangeAspect="1"/>
+            </wp:cNvGraphicFramePr>
+            <a:graphic xmlns:a="http://schemas.openxmlformats.org/drawingml/2006/main">
+              <a:graphicData uri="http://schemas.openxmlformats.org/drawingml/2006/picture">
+                <pic:pic xmlns:pic="http://schemas.openxmlformats.org/drawingml/2006/picture">
+                  <pic:nvPicPr>
+                    <pic:cNvPr id="340405106" name="Picture 340405106"/>
                     <pic:cNvPicPr/>
                   </pic:nvPicPr>
                   <pic:blipFill>
-                    <a:blip r:embed="rId9">
+                    <a:blip r:embed="rId11" cstate="print">
                       <a:extLst>
                         <a:ext uri="{28A0092B-C50C-407E-A947-70E740481C1C}">
                           <a14:useLocalDpi xmlns:a14="http://schemas.microsoft.com/office/drawing/2010/main" val="0"/>
@@ -3679,7 +3891,7 @@
                   <pic:spPr>
                     <a:xfrm>
                       <a:off x="0" y="0"/>
-                      <a:ext cx="5731510" cy="2417445"/>
+                      <a:ext cx="4817279" cy="3342101"/>
                     </a:xfrm>
                     <a:prstGeom prst="rect">
                       <a:avLst/>
@@ -3694,262 +3906,19 @@
     </w:p>
     <w:p>
       <w:pPr>
-        <w:jc w:val="both"/>
-        <w:rPr>
-          <w:lang w:val="hr-HR"/>
-        </w:rPr>
-      </w:pPr>
-      <w:r>
-        <w:rPr>
-          <w:lang w:val="hr-HR"/>
-        </w:rPr>
-        <w:tab/>
-      </w:r>
+        <w:rPr>
+          <w:lang w:val="hr-HR"/>
+        </w:rPr>
+      </w:pPr>
     </w:p>
     <w:p>
       <w:pPr>
-        <w:pStyle w:val="Caption"/>
-        <w:keepNext/>
-        <w:jc w:val="center"/>
-        <w:rPr>
-          <w:lang w:val="hr-HR"/>
-        </w:rPr>
-      </w:pPr>
-      <w:r>
-        <w:rPr>
-          <w:lang w:val="hr-HR"/>
-        </w:rPr>
-        <w:lastRenderedPageBreak/>
-        <w:t xml:space="preserve">Tablica </w:t>
-      </w:r>
-      <w:r>
-        <w:rPr>
-          <w:lang w:val="hr-HR"/>
-        </w:rPr>
-        <w:fldChar w:fldCharType="begin"/>
-      </w:r>
-      <w:r>
-        <w:rPr>
-          <w:lang w:val="hr-HR"/>
-        </w:rPr>
-        <w:instrText xml:space="preserve"> SEQ Tablica \* ARABIC </w:instrText>
-      </w:r>
-      <w:r>
-        <w:rPr>
-          <w:lang w:val="hr-HR"/>
-        </w:rPr>
-        <w:fldChar w:fldCharType="separate"/>
-      </w:r>
-      <w:r>
-        <w:rPr>
-          <w:noProof/>
-          <w:lang w:val="hr-HR"/>
-        </w:rPr>
-        <w:t>3</w:t>
-      </w:r>
-      <w:r>
-        <w:rPr>
-          <w:lang w:val="hr-HR"/>
-        </w:rPr>
-        <w:fldChar w:fldCharType="end"/>
-      </w:r>
-      <w:r>
-        <w:rPr>
-          <w:lang w:val="hr-HR"/>
-        </w:rPr>
-        <w:t>: orbitalni podaci unutarnjeg sustava i udaljenije komponente te izvori svih podataka</w:t>
-      </w:r>
-      <w:r>
-        <w:rPr>
-          <w:lang w:val="hr-HR"/>
-        </w:rPr>
-        <w:t>.</w:t>
-      </w:r>
-    </w:p>
-    <w:p>
-      <w:pPr>
-        <w:jc w:val="center"/>
-        <w:rPr>
-          <w:lang w:val="hr-HR"/>
-        </w:rPr>
-      </w:pPr>
-      <w:r>
-        <w:rPr>
-          <w:noProof/>
-          <w:lang w:val="hr-HR"/>
-        </w:rPr>
-        <w:drawing>
-          <wp:inline distT="0" distB="0" distL="0" distR="0" wp14:anchorId="630AF75B" wp14:editId="65950AA3">
-            <wp:extent cx="5731510" cy="2138680"/>
-            <wp:effectExtent l="0" t="0" r="0" b="0"/>
-            <wp:docPr id="53540156" name="Picture 8" descr="A screenshot of a computer&#10;&#10;AI-generated content may be incorrect."/>
-            <wp:cNvGraphicFramePr>
-              <a:graphicFrameLocks xmlns:a="http://schemas.openxmlformats.org/drawingml/2006/main" noChangeAspect="1"/>
-            </wp:cNvGraphicFramePr>
-            <a:graphic xmlns:a="http://schemas.openxmlformats.org/drawingml/2006/main">
-              <a:graphicData uri="http://schemas.openxmlformats.org/drawingml/2006/picture">
-                <pic:pic xmlns:pic="http://schemas.openxmlformats.org/drawingml/2006/picture">
-                  <pic:nvPicPr>
-                    <pic:cNvPr id="53540156" name="Picture 8" descr="A screenshot of a computer&#10;&#10;AI-generated content may be incorrect."/>
-                    <pic:cNvPicPr/>
-                  </pic:nvPicPr>
-                  <pic:blipFill>
-                    <a:blip r:embed="rId10">
-                      <a:extLst>
-                        <a:ext uri="{28A0092B-C50C-407E-A947-70E740481C1C}">
-                          <a14:useLocalDpi xmlns:a14="http://schemas.microsoft.com/office/drawing/2010/main" val="0"/>
-                        </a:ext>
-                      </a:extLst>
-                    </a:blip>
-                    <a:stretch>
-                      <a:fillRect/>
-                    </a:stretch>
-                  </pic:blipFill>
-                  <pic:spPr>
-                    <a:xfrm>
-                      <a:off x="0" y="0"/>
-                      <a:ext cx="5731510" cy="2138680"/>
-                    </a:xfrm>
-                    <a:prstGeom prst="rect">
-                      <a:avLst/>
-                    </a:prstGeom>
-                  </pic:spPr>
-                </pic:pic>
-              </a:graphicData>
-            </a:graphic>
-          </wp:inline>
-        </w:drawing>
-      </w:r>
-    </w:p>
-    <w:p>
-      <w:pPr>
-        <w:rPr>
-          <w:lang w:val="hr-HR"/>
-        </w:rPr>
-      </w:pPr>
-    </w:p>
-    <w:p>
-      <w:pPr>
-        <w:pStyle w:val="Caption"/>
-        <w:jc w:val="center"/>
-        <w:rPr>
-          <w:lang w:val="hr-HR"/>
-        </w:rPr>
-      </w:pPr>
-      <w:r>
-        <w:rPr>
-          <w:lang w:val="hr-HR"/>
-        </w:rPr>
-        <w:t xml:space="preserve">Tablica </w:t>
-      </w:r>
-      <w:r>
-        <w:rPr>
-          <w:lang w:val="hr-HR"/>
-        </w:rPr>
-        <w:fldChar w:fldCharType="begin"/>
-      </w:r>
-      <w:r>
-        <w:rPr>
-          <w:lang w:val="hr-HR"/>
-        </w:rPr>
-        <w:instrText xml:space="preserve"> SEQ Tablica \* ARABIC </w:instrText>
-      </w:r>
-      <w:r>
-        <w:rPr>
-          <w:lang w:val="hr-HR"/>
-        </w:rPr>
-        <w:fldChar w:fldCharType="separate"/>
-      </w:r>
-      <w:r>
-        <w:rPr>
-          <w:noProof/>
-          <w:lang w:val="hr-HR"/>
-        </w:rPr>
-        <w:t>4</w:t>
-      </w:r>
-      <w:r>
-        <w:rPr>
-          <w:lang w:val="hr-HR"/>
-        </w:rPr>
-        <w:fldChar w:fldCharType="end"/>
-      </w:r>
-      <w:r>
-        <w:rPr>
-          <w:lang w:val="hr-HR"/>
-        </w:rPr>
-        <w:t>: orbitalni period, velika poluos staze, radijus i masa planeta, ekscentricitet te temperatura planeta unutar egzoplanetarnih sustava odabranih sustava triju zvijezda.</w:t>
-      </w:r>
-    </w:p>
-    <w:p>
-      <w:pPr>
-        <w:jc w:val="center"/>
-        <w:rPr>
-          <w:lang w:val="hr-HR"/>
-        </w:rPr>
-      </w:pPr>
-      <w:r>
-        <w:rPr>
-          <w:noProof/>
-          <w:lang w:val="hr-HR"/>
-        </w:rPr>
-        <w:drawing>
-          <wp:inline distT="0" distB="0" distL="0" distR="0" wp14:anchorId="58235BDC" wp14:editId="6BCF155C">
-            <wp:extent cx="4533900" cy="3327400"/>
-            <wp:effectExtent l="0" t="0" r="0" b="0"/>
-            <wp:docPr id="1676100852" name="Picture 9" descr="A table of numbers and a few black text&#10;&#10;AI-generated content may be incorrect."/>
-            <wp:cNvGraphicFramePr>
-              <a:graphicFrameLocks xmlns:a="http://schemas.openxmlformats.org/drawingml/2006/main" noChangeAspect="1"/>
-            </wp:cNvGraphicFramePr>
-            <a:graphic xmlns:a="http://schemas.openxmlformats.org/drawingml/2006/main">
-              <a:graphicData uri="http://schemas.openxmlformats.org/drawingml/2006/picture">
-                <pic:pic xmlns:pic="http://schemas.openxmlformats.org/drawingml/2006/picture">
-                  <pic:nvPicPr>
-                    <pic:cNvPr id="1676100852" name="Picture 9" descr="A table of numbers and a few black text&#10;&#10;AI-generated content may be incorrect."/>
-                    <pic:cNvPicPr/>
-                  </pic:nvPicPr>
-                  <pic:blipFill>
-                    <a:blip r:embed="rId11">
-                      <a:extLst>
-                        <a:ext uri="{28A0092B-C50C-407E-A947-70E740481C1C}">
-                          <a14:useLocalDpi xmlns:a14="http://schemas.microsoft.com/office/drawing/2010/main" val="0"/>
-                        </a:ext>
-                      </a:extLst>
-                    </a:blip>
-                    <a:stretch>
-                      <a:fillRect/>
-                    </a:stretch>
-                  </pic:blipFill>
-                  <pic:spPr>
-                    <a:xfrm>
-                      <a:off x="0" y="0"/>
-                      <a:ext cx="4533900" cy="3327400"/>
-                    </a:xfrm>
-                    <a:prstGeom prst="rect">
-                      <a:avLst/>
-                    </a:prstGeom>
-                  </pic:spPr>
-                </pic:pic>
-              </a:graphicData>
-            </a:graphic>
-          </wp:inline>
-        </w:drawing>
-      </w:r>
-    </w:p>
-    <w:p>
-      <w:pPr>
-        <w:rPr>
-          <w:lang w:val="hr-HR"/>
-        </w:rPr>
-      </w:pPr>
-    </w:p>
-    <w:p>
-      <w:pPr>
         <w:pStyle w:val="Heading2"/>
         <w:rPr>
           <w:lang w:val="hr-HR"/>
         </w:rPr>
       </w:pPr>
-      <w:bookmarkStart w:id="5" w:name="_Toc225707074"/>
+      <w:bookmarkStart w:id="5" w:name="_Toc225952499"/>
       <w:r>
         <w:rPr>
           <w:lang w:val="hr-HR"/>
@@ -3981,32 +3950,76 @@
         <w:rPr>
           <w:lang w:val="hr-HR"/>
         </w:rPr>
-        <w:t xml:space="preserve">Cilj za ta dva sustava je istražiti njihovu dugoročnu evoluciju </w:t>
-      </w:r>
-      <w:r>
-        <w:rPr>
-          <w:lang w:val="hr-HR"/>
-        </w:rPr>
-        <w:t>do 10 milijuna godina</w:t>
-      </w:r>
-      <w:r>
-        <w:rPr>
-          <w:lang w:val="hr-HR"/>
-        </w:rPr>
-        <w:t xml:space="preserve">. Međutim, nepoznati su orbitalni parametri vanjskog sustava, odnosno sustava C s egzoplanetima oko AB binarnog sustava za Gliese 667 i za LTT 1445 nije poznat vanjski sustav A oko BC. </w:t>
-      </w:r>
-      <w:r>
-        <w:rPr>
-          <w:lang w:val="hr-HR"/>
-        </w:rPr>
-        <w:t xml:space="preserve">Osim ova dva specifična sustava, ostalih 8 također nema </w:t>
-      </w:r>
-      <w:r>
-        <w:rPr>
-          <w:lang w:val="hr-HR"/>
-        </w:rPr>
-        <w:t xml:space="preserve">neke orbitalne elemente ni unutarnjih ni vanjskih sustava, odnosno ekscentricitet, inklinaciju, longitudu ulaznog čvora i argument pericentra. </w:t>
-      </w:r>
+        <w:t xml:space="preserve">Međutim, nepoznati su orbitalni parametri vanjskog sustava, odnosno sustava C s egzoplanetima oko AB binarnog sustava za Gliese 667 i za LTT 1445 nije poznat vanjski sustav A oko BC. </w:t>
+      </w:r>
+      <w:r>
+        <w:rPr>
+          <w:lang w:val="hr-HR"/>
+        </w:rPr>
+        <w:t>HD 132563</w:t>
+      </w:r>
+      <w:r>
+        <w:rPr>
+          <w:lang w:val="hr-HR"/>
+        </w:rPr>
+        <w:t xml:space="preserve"> nema </w:t>
+      </w:r>
+      <w:r>
+        <w:rPr>
+          <w:lang w:val="hr-HR"/>
+        </w:rPr>
+        <w:t>ni vanjske</w:t>
+      </w:r>
+      <w:r>
+        <w:rPr>
+          <w:lang w:val="hr-HR"/>
+        </w:rPr>
+        <w:t xml:space="preserve"> </w:t>
+      </w:r>
+      <w:r>
+        <w:rPr>
+          <w:lang w:val="hr-HR"/>
+        </w:rPr>
+        <w:t xml:space="preserve">ni unutarnje </w:t>
+      </w:r>
+      <w:r>
+        <w:rPr>
+          <w:lang w:val="hr-HR"/>
+        </w:rPr>
+        <w:t>orbitalne elemente</w:t>
+      </w:r>
+      <w:r>
+        <w:rPr>
+          <w:lang w:val="hr-HR"/>
+        </w:rPr>
+        <w:t xml:space="preserve">, </w:t>
+      </w:r>
+      <w:r>
+        <w:rPr>
+          <w:lang w:val="hr-HR"/>
+        </w:rPr>
+        <w:t>ustav 94 Ceti je u potpunosti definiran, a Kepler-444 nema unutarnji sustav definiran</w:t>
+      </w:r>
+      <w:r>
+        <w:rPr>
+          <w:lang w:val="hr-HR"/>
+        </w:rPr>
+        <w:t xml:space="preserve">. </w:t>
+      </w:r>
+    </w:p>
+    <w:p>
+      <w:pPr>
+        <w:rPr>
+          <w:lang w:val="hr-HR"/>
+        </w:rPr>
+      </w:pPr>
+    </w:p>
+    <w:p>
+      <w:pPr>
+        <w:rPr>
+          <w:lang w:val="hr-HR"/>
+        </w:rPr>
+      </w:pPr>
       <w:r>
         <w:rPr>
           <w:lang w:val="hr-HR"/>
@@ -4037,14 +4050,7 @@
         <w:rPr>
           <w:lang w:val="hr-HR"/>
         </w:rPr>
-        <w:t xml:space="preserve">Radi jednostavnosti simulacija, postavit ću </w:t>
-      </w:r>
-      <w:r>
-        <w:rPr>
-          <w:lang w:val="hr-HR"/>
-        </w:rPr>
-        <w:lastRenderedPageBreak/>
-        <w:t xml:space="preserve">longitudu ulaznog čvora i argument pericentra na 0, po uzoru na </w:t>
+        <w:t xml:space="preserve">Radi jednostavnosti simulacija, postavit ću longitudu ulaznog čvora i argument pericentra na 0, po uzoru na </w:t>
       </w:r>
       <w:r>
         <w:rPr>
@@ -4058,7 +4064,13 @@
         <w:rPr>
           <w:lang w:val="hr-HR"/>
         </w:rPr>
-        <w:t xml:space="preserve"> [36]</w:t>
+        <w:t xml:space="preserve"> [</w:t>
+      </w:r>
+      <w:r>
+        <w:rPr>
+          <w:lang w:val="hr-HR"/>
+        </w:rPr>
+        <w:t>29]</w:t>
       </w:r>
       <w:r>
         <w:rPr>
@@ -4398,6 +4410,7 @@
               <w:rPr>
                 <w:lang w:val="hr-HR"/>
               </w:rPr>
+              <w:lastRenderedPageBreak/>
               <w:t>Unutarnji sustav</w:t>
             </w:r>
           </w:p>
@@ -4507,7 +4520,19 @@
         <w:rPr>
           <w:lang w:val="hr-HR"/>
         </w:rPr>
-        <w:t xml:space="preserve"> Ekscentricitet unutarnjeg sustava postavljen je na vrijednost od 0.4, jer za binarne sustave s periodom od 10 do 100 godina prosječna vrijednost je 0.4 [37]. </w:t>
+        <w:t xml:space="preserve"> Ekscentricitet unutarnjeg sustava postavljen je na vrijednost od 0.4, jer za binarne sustave s periodom od 10 do 100 godina prosječna vrijednost je 0.4 [3</w:t>
+      </w:r>
+      <w:r>
+        <w:rPr>
+          <w:lang w:val="hr-HR"/>
+        </w:rPr>
+        <w:t>0</w:t>
+      </w:r>
+      <w:r>
+        <w:rPr>
+          <w:lang w:val="hr-HR"/>
+        </w:rPr>
+        <w:t xml:space="preserve">]. </w:t>
       </w:r>
       <w:r>
         <w:rPr>
@@ -4542,7 +4567,7 @@
           <w:lang w:val="hr-HR"/>
         </w:rPr>
       </w:pPr>
-      <w:bookmarkStart w:id="6" w:name="_Toc225707075"/>
+      <w:bookmarkStart w:id="6" w:name="_Toc225952500"/>
       <w:r>
         <w:rPr>
           <w:lang w:val="hr-HR"/>
@@ -4568,7 +4593,43 @@
         <w:rPr>
           <w:lang w:val="hr-HR"/>
         </w:rPr>
-        <w:t xml:space="preserve">Ostalih 8 sustava imaju egzoplanet koji nije terestrički ili super-zemlja te nije habitabilan. Međutim, to ne znači da nije moguće da takav sustav postoji u svemiru s habitabilnim planetom. </w:t>
+        <w:t>Ostal</w:t>
+      </w:r>
+      <w:r>
+        <w:rPr>
+          <w:lang w:val="hr-HR"/>
+        </w:rPr>
+        <w:t>a</w:t>
+      </w:r>
+      <w:r>
+        <w:rPr>
+          <w:lang w:val="hr-HR"/>
+        </w:rPr>
+        <w:t xml:space="preserve"> </w:t>
+      </w:r>
+      <w:r>
+        <w:rPr>
+          <w:lang w:val="hr-HR"/>
+        </w:rPr>
+        <w:t>3</w:t>
+      </w:r>
+      <w:r>
+        <w:rPr>
+          <w:lang w:val="hr-HR"/>
+        </w:rPr>
+        <w:t xml:space="preserve"> sustava imaju egzoplanet koji nije terestrički ili super-zemlja te nije habitabilan. Međutim, to ne znači da nije moguće da takav sustav postoji u svemiru s habitabilnim planetom</w:t>
+      </w:r>
+      <w:r>
+        <w:rPr>
+          <w:lang w:val="hr-HR"/>
+        </w:rPr>
+        <w:t xml:space="preserve"> ili da habitabilan egzoplanet još nismo otkrili oko ovih sustava</w:t>
+      </w:r>
+      <w:r>
+        <w:rPr>
+          <w:lang w:val="hr-HR"/>
+        </w:rPr>
+        <w:t xml:space="preserve">. </w:t>
       </w:r>
       <w:r>
         <w:rPr>
@@ -4954,7 +5015,6 @@
           <w:lang w:val="hr-HR"/>
         </w:rPr>
       </w:pPr>
-      <w:bookmarkStart w:id="7" w:name="_Toc225707076"/>
       <w:r>
         <w:rPr>
           <w:lang w:val="hr-HR"/>
@@ -4969,6 +5029,7 @@
           <w:lang w:val="hr-HR"/>
         </w:rPr>
       </w:pPr>
+      <w:bookmarkStart w:id="7" w:name="_Toc225952501"/>
       <w:r>
         <w:rPr>
           <w:lang w:val="hr-HR"/>
@@ -5021,7 +5082,25 @@
         <w:rPr>
           <w:lang w:val="hr-HR"/>
         </w:rPr>
-        <w:t xml:space="preserve"> okruženja s 8 CPU jezgri. Uz tehničke specifikacije, programski jezici su Python 3.1</w:t>
+        <w:t xml:space="preserve"> okruženja</w:t>
+      </w:r>
+      <w:r>
+        <w:rPr>
+          <w:lang w:val="hr-HR"/>
+        </w:rPr>
+        <w:t xml:space="preserve">. </w:t>
+      </w:r>
+      <w:r>
+        <w:rPr>
+          <w:lang w:val="hr-HR"/>
+        </w:rPr>
+        <w:t>Provela sam simulacije na Google Colab Pro platformi, s 8 CPU jezgri i 52.1 GB RAM-a</w:t>
+      </w:r>
+      <w:r>
+        <w:rPr>
+          <w:lang w:val="hr-HR"/>
+        </w:rPr>
+        <w:t>. Uz tehničke specifikacije, programski jezici su Python 3.1</w:t>
       </w:r>
       <w:r>
         <w:rPr>
@@ -5061,7 +5140,7 @@
         <w:rPr>
           <w:lang w:val="hr-HR"/>
         </w:rPr>
-        <w:t>,</w:t>
+        <w:t xml:space="preserve"> i</w:t>
       </w:r>
       <w:r>
         <w:rPr>
@@ -5087,7 +5166,25 @@
         <w:rPr>
           <w:lang w:val="hr-HR"/>
         </w:rPr>
-        <w:t xml:space="preserve">i </w:t>
+        <w:t xml:space="preserve">za </w:t>
+      </w:r>
+      <w:r>
+        <w:rPr>
+          <w:lang w:val="hr-HR"/>
+        </w:rPr>
+        <w:t>vizualizaciju podataka</w:t>
+      </w:r>
+      <w:r>
+        <w:rPr>
+          <w:lang w:val="hr-HR"/>
+        </w:rPr>
+        <w:t xml:space="preserve"> te</w:t>
+      </w:r>
+      <w:r>
+        <w:rPr>
+          <w:lang w:val="hr-HR"/>
+        </w:rPr>
+        <w:t xml:space="preserve"> </w:t>
       </w:r>
       <w:r>
         <w:rPr>
@@ -5095,38 +5192,6 @@
           <w:iCs/>
           <w:lang w:val="hr-HR"/>
         </w:rPr>
-        <w:t>pyqtgraph</w:t>
-      </w:r>
-      <w:r>
-        <w:rPr>
-          <w:lang w:val="hr-HR"/>
-        </w:rPr>
-        <w:t xml:space="preserve">  za </w:t>
-      </w:r>
-      <w:r>
-        <w:rPr>
-          <w:lang w:val="hr-HR"/>
-        </w:rPr>
-        <w:t>vizualizaciju podataka</w:t>
-      </w:r>
-      <w:r>
-        <w:rPr>
-          <w:lang w:val="hr-HR"/>
-        </w:rPr>
-        <w:t xml:space="preserve"> te</w:t>
-      </w:r>
-      <w:r>
-        <w:rPr>
-          <w:lang w:val="hr-HR"/>
-        </w:rPr>
-        <w:t xml:space="preserve"> </w:t>
-      </w:r>
-      <w:r>
-        <w:rPr>
-          <w:i/>
-          <w:iCs/>
-          <w:lang w:val="hr-HR"/>
-        </w:rPr>
         <w:t>h5py</w:t>
       </w:r>
       <w:r>
@@ -5176,7 +5241,7 @@
           <w:lang w:val="hr-HR"/>
         </w:rPr>
       </w:pPr>
-      <w:bookmarkStart w:id="8" w:name="_Toc225707077"/>
+      <w:bookmarkStart w:id="8" w:name="_Toc225952502"/>
       <w:r>
         <w:rPr>
           <w:lang w:val="hr-HR"/>
@@ -5417,7 +5482,6 @@
         <w:rPr>
           <w:lang w:val="hr-HR"/>
         </w:rPr>
-        <w:lastRenderedPageBreak/>
         <w:t>Zbog specifičnosti svakog sustava i različitog koordinatnog sustava koji je potreban za postavu svakog sustava, potrebno je napraviti 5 zasebnih programa integratora koji bi se onda koristio za svaki sustav zasebno.</w:t>
       </w:r>
       <w:r>
@@ -8304,19 +8368,7 @@
               <w:rPr>
                 <w:lang w:val="hr-HR"/>
               </w:rPr>
-              <w:t>(</w:t>
-            </w:r>
-            <w:r>
-              <w:rPr>
-                <w:lang w:val="hr-HR"/>
-              </w:rPr>
-              <w:t>6</w:t>
-            </w:r>
-            <w:r>
-              <w:rPr>
-                <w:lang w:val="hr-HR"/>
-              </w:rPr>
-              <w:t>)</w:t>
+              <w:t>(6)</w:t>
             </w:r>
           </w:p>
         </w:tc>
@@ -11541,14 +11593,7 @@
                         <w:rFonts w:ascii="Cambria Math" w:hAnsi="Cambria Math"/>
                         <w:lang w:val="hr-HR"/>
                       </w:rPr>
-                      <m:t xml:space="preserve"> </m:t>
-                    </m:r>
-                    <m:r>
-                      <w:rPr>
-                        <w:rFonts w:ascii="Cambria Math" w:hAnsi="Cambria Math"/>
-                        <w:lang w:val="hr-HR"/>
-                      </w:rPr>
-                      <m:t>+∑</m:t>
+                      <m:t xml:space="preserve"> +∑</m:t>
                     </m:r>
                     <m:sSub>
                       <m:sSubPr>
@@ -11702,14 +11747,7 @@
                         <w:rFonts w:ascii="Cambria Math" w:hAnsi="Cambria Math"/>
                         <w:lang w:val="hr-HR"/>
                       </w:rPr>
-                      <m:t xml:space="preserve">+ </m:t>
-                    </m:r>
-                    <m:r>
-                      <w:rPr>
-                        <w:rFonts w:ascii="Cambria Math" w:hAnsi="Cambria Math"/>
-                        <w:lang w:val="hr-HR"/>
-                      </w:rPr>
-                      <m:t>+∑</m:t>
+                      <m:t>+ +∑</m:t>
                     </m:r>
                     <m:sSub>
                       <m:sSubPr>
@@ -13539,14 +13577,7 @@
                         <w:rFonts w:ascii="Cambria Math" w:hAnsi="Cambria Math"/>
                         <w:lang w:val="hr-HR"/>
                       </w:rPr>
-                      <m:t xml:space="preserve"> </m:t>
-                    </m:r>
-                    <m:r>
-                      <w:rPr>
-                        <w:rFonts w:ascii="Cambria Math" w:hAnsi="Cambria Math"/>
-                        <w:lang w:val="hr-HR"/>
-                      </w:rPr>
-                      <m:t>+∑</m:t>
+                      <m:t xml:space="preserve"> +∑</m:t>
                     </m:r>
                     <m:sSub>
                       <m:sSubPr>
@@ -15746,7 +15777,7 @@
           <w:lang w:val="hr-HR"/>
         </w:rPr>
       </w:pPr>
-      <w:bookmarkStart w:id="9" w:name="_Toc225707078"/>
+      <w:bookmarkStart w:id="9" w:name="_Toc225952503"/>
       <w:r>
         <w:rPr>
           <w:lang w:val="hr-HR"/>
@@ -15963,19 +15994,7 @@
               <w:rPr>
                 <w:lang w:val="hr-HR"/>
               </w:rPr>
-              <w:t>(</w:t>
-            </w:r>
-            <w:r>
-              <w:rPr>
-                <w:lang w:val="hr-HR"/>
-              </w:rPr>
-              <w:t>12</w:t>
-            </w:r>
-            <w:r>
-              <w:rPr>
-                <w:lang w:val="hr-HR"/>
-              </w:rPr>
-              <w:t>)</w:t>
+              <w:t>(12)</w:t>
             </w:r>
           </w:p>
         </w:tc>
@@ -16661,14 +16680,7 @@
                     <w:rFonts w:ascii="Cambria Math" w:hAnsi="Cambria Math"/>
                     <w:lang w:val="hr-HR"/>
                   </w:rPr>
-                  <m:t>= -</m:t>
-                </m:r>
-                <m:r>
-                  <w:rPr>
-                    <w:rFonts w:ascii="Cambria Math" w:hAnsi="Cambria Math"/>
-                    <w:lang w:val="hr-HR"/>
-                  </w:rPr>
-                  <m:t>G</m:t>
+                  <m:t>= -G</m:t>
                 </m:r>
                 <m:sSub>
                   <m:sSubPr>
@@ -17176,14 +17188,7 @@
                     <w:rFonts w:ascii="Cambria Math" w:hAnsi="Cambria Math"/>
                     <w:lang w:val="hr-HR"/>
                   </w:rPr>
-                  <m:t>= -</m:t>
-                </m:r>
-                <m:r>
-                  <w:rPr>
-                    <w:rFonts w:ascii="Cambria Math" w:hAnsi="Cambria Math"/>
-                    <w:lang w:val="hr-HR"/>
-                  </w:rPr>
-                  <m:t>G</m:t>
+                  <m:t>= -G</m:t>
                 </m:r>
                 <m:sSub>
                   <m:sSubPr>
@@ -17863,14 +17868,7 @@
                     <w:rFonts w:ascii="Cambria Math" w:hAnsi="Cambria Math"/>
                     <w:lang w:val="hr-HR"/>
                   </w:rPr>
-                  <m:t>= -</m:t>
-                </m:r>
-                <m:r>
-                  <w:rPr>
-                    <w:rFonts w:ascii="Cambria Math" w:hAnsi="Cambria Math"/>
-                    <w:lang w:val="hr-HR"/>
-                  </w:rPr>
-                  <m:t>G</m:t>
+                  <m:t>= -G</m:t>
                 </m:r>
                 <m:sSub>
                   <m:sSubPr>
@@ -18378,14 +18376,7 @@
                     <w:rFonts w:ascii="Cambria Math" w:hAnsi="Cambria Math"/>
                     <w:lang w:val="hr-HR"/>
                   </w:rPr>
-                  <m:t>= -</m:t>
-                </m:r>
-                <m:r>
-                  <w:rPr>
-                    <w:rFonts w:ascii="Cambria Math" w:hAnsi="Cambria Math"/>
-                    <w:lang w:val="hr-HR"/>
-                  </w:rPr>
-                  <m:t>G</m:t>
+                  <m:t>= -G</m:t>
                 </m:r>
                 <m:sSub>
                   <m:sSubPr>
@@ -18803,7 +18794,7 @@
           <w:lang w:val="hr-HR"/>
         </w:rPr>
       </w:pPr>
-      <w:bookmarkStart w:id="10" w:name="_Toc225707079"/>
+      <w:bookmarkStart w:id="10" w:name="_Toc225952504"/>
       <w:r>
         <w:rPr>
           <w:lang w:val="hr-HR"/>
@@ -18846,7 +18837,7 @@
           <w:lang w:val="hr-HR"/>
         </w:rPr>
       </w:pPr>
-      <w:bookmarkStart w:id="11" w:name="_Toc225707080"/>
+      <w:bookmarkStart w:id="11" w:name="_Toc225952505"/>
       <w:r>
         <w:rPr>
           <w:lang w:val="hr-HR"/>
@@ -18890,7 +18881,7 @@
           <w:lang w:val="hr-HR"/>
         </w:rPr>
       </w:pPr>
-      <w:bookmarkStart w:id="12" w:name="_Toc225707081"/>
+      <w:bookmarkStart w:id="12" w:name="_Toc225952506"/>
       <w:r>
         <w:rPr>
           <w:lang w:val="hr-HR"/>
@@ -18934,7 +18925,7 @@
           <w:lang w:val="hr-HR"/>
         </w:rPr>
       </w:pPr>
-      <w:bookmarkStart w:id="13" w:name="_Toc225707082"/>
+      <w:bookmarkStart w:id="13" w:name="_Toc225952507"/>
       <w:r>
         <w:rPr>
           <w:lang w:val="hr-HR"/>
@@ -19693,7 +19684,25 @@
         <w:rPr>
           <w:lang w:val="hr-HR"/>
         </w:rPr>
-        <w:t>[29] Bechter et al. 2014</w:t>
+        <w:t>[</w:t>
+      </w:r>
+      <w:r>
+        <w:rPr>
+          <w:lang w:val="hr-HR"/>
+        </w:rPr>
+        <w:t>29</w:t>
+      </w:r>
+      <w:r>
+        <w:rPr>
+          <w:lang w:val="hr-HR"/>
+        </w:rPr>
+        <w:t>] Long-Term Stability of Planets in Binary Systems</w:t>
+      </w:r>
+      <w:r>
+        <w:rPr>
+          <w:lang w:val="hr-HR"/>
+        </w:rPr>
+        <w:t>, holman and wiegert 1998</w:t>
       </w:r>
     </w:p>
     <w:p>
@@ -19706,172 +19715,27 @@
         <w:rPr>
           <w:lang w:val="hr-HR"/>
         </w:rPr>
-        <w:t xml:space="preserve">[30] </w:t>
+        <w:t>[</w:t>
+      </w:r>
+      <w:r>
+        <w:rPr>
+          <w:lang w:val="hr-HR"/>
+        </w:rPr>
+        <w:t>30</w:t>
+      </w:r>
+      <w:r>
+        <w:rPr>
+          <w:lang w:val="hr-HR"/>
+        </w:rPr>
+        <w:t>]</w:t>
+      </w:r>
+      <w:r>
+        <w:rPr>
+          <w:lang w:val="hr-HR"/>
+        </w:rPr>
+        <w:t xml:space="preserve"> </w:t>
       </w:r>
       <w:hyperlink r:id="rId27" w:history="1">
-        <w:r>
-          <w:rPr>
-            <w:rStyle w:val="Hyperlink"/>
-            <w:lang w:val="hr-HR"/>
-          </w:rPr>
-          <w:t>https://en.wikipedia.org/wiki/WASP-12</w:t>
-        </w:r>
-      </w:hyperlink>
-      <w:r>
-        <w:rPr>
-          <w:lang w:val="hr-HR"/>
-        </w:rPr>
-        <w:t xml:space="preserve"> </w:t>
-      </w:r>
-    </w:p>
-    <w:p>
-      <w:pPr>
-        <w:rPr>
-          <w:lang w:val="hr-HR"/>
-        </w:rPr>
-      </w:pPr>
-      <w:r>
-        <w:rPr>
-          <w:lang w:val="hr-HR"/>
-        </w:rPr>
-        <w:t xml:space="preserve">[31] </w:t>
-      </w:r>
-      <w:hyperlink r:id="rId28" w:history="1">
-        <w:r>
-          <w:rPr>
-            <w:rStyle w:val="Hyperlink"/>
-            <w:lang w:val="hr-HR"/>
-          </w:rPr>
-          <w:t>https://en.wikipedia.org/wiki/Gliese_229</w:t>
-        </w:r>
-      </w:hyperlink>
-      <w:r>
-        <w:rPr>
-          <w:lang w:val="hr-HR"/>
-        </w:rPr>
-        <w:t xml:space="preserve"> </w:t>
-      </w:r>
-    </w:p>
-    <w:p>
-      <w:pPr>
-        <w:rPr>
-          <w:lang w:val="hr-HR"/>
-        </w:rPr>
-      </w:pPr>
-      <w:r>
-        <w:rPr>
-          <w:lang w:val="hr-HR"/>
-        </w:rPr>
-        <w:t>[32] Nature 2024 / arXiv 2025 summaries for Ba/Bb Gliese 229</w:t>
-      </w:r>
-    </w:p>
-    <w:p>
-      <w:pPr>
-        <w:rPr>
-          <w:lang w:val="hr-HR"/>
-        </w:rPr>
-      </w:pPr>
-      <w:r>
-        <w:rPr>
-          <w:lang w:val="hr-HR"/>
-        </w:rPr>
-        <w:t xml:space="preserve">[33] </w:t>
-      </w:r>
-      <w:hyperlink r:id="rId29" w:history="1">
-        <w:r>
-          <w:rPr>
-            <w:rStyle w:val="Hyperlink"/>
-            <w:lang w:val="hr-HR"/>
-          </w:rPr>
-          <w:t>https://en.wikipedia.org/wiki/Gliese_900</w:t>
-        </w:r>
-      </w:hyperlink>
-      <w:r>
-        <w:rPr>
-          <w:lang w:val="hr-HR"/>
-        </w:rPr>
-        <w:t xml:space="preserve"> </w:t>
-      </w:r>
-    </w:p>
-    <w:p>
-      <w:pPr>
-        <w:rPr>
-          <w:lang w:val="hr-HR"/>
-        </w:rPr>
-      </w:pPr>
-      <w:r>
-        <w:rPr>
-          <w:lang w:val="hr-HR"/>
-        </w:rPr>
-        <w:t>[34] Schlagenhauf et al. 2024</w:t>
-      </w:r>
-    </w:p>
-    <w:p>
-      <w:pPr>
-        <w:rPr>
-          <w:lang w:val="hr-HR"/>
-        </w:rPr>
-      </w:pPr>
-      <w:r>
-        <w:rPr>
-          <w:lang w:val="hr-HR"/>
-        </w:rPr>
-        <w:t xml:space="preserve">[35] </w:t>
-      </w:r>
-      <w:hyperlink r:id="rId30" w:history="1">
-        <w:r>
-          <w:rPr>
-            <w:rStyle w:val="Hyperlink"/>
-            <w:lang w:val="hr-HR"/>
-          </w:rPr>
-          <w:t>https://en.wikipedia.org/wiki/HD_65216</w:t>
-        </w:r>
-      </w:hyperlink>
-      <w:r>
-        <w:rPr>
-          <w:lang w:val="hr-HR"/>
-        </w:rPr>
-        <w:t xml:space="preserve"> </w:t>
-      </w:r>
-    </w:p>
-    <w:p>
-      <w:pPr>
-        <w:rPr>
-          <w:lang w:val="hr-HR"/>
-        </w:rPr>
-      </w:pPr>
-      <w:r>
-        <w:rPr>
-          <w:lang w:val="hr-HR"/>
-        </w:rPr>
-        <w:t>[36] Long-Term Stability of Planets in Binary Systems</w:t>
-      </w:r>
-      <w:r>
-        <w:rPr>
-          <w:lang w:val="hr-HR"/>
-        </w:rPr>
-        <w:t>, holman and wiegert 1998</w:t>
-      </w:r>
-    </w:p>
-    <w:p>
-      <w:pPr>
-        <w:rPr>
-          <w:lang w:val="hr-HR"/>
-        </w:rPr>
-      </w:pPr>
-      <w:r>
-        <w:rPr>
-          <w:lang w:val="hr-HR"/>
-        </w:rPr>
-        <w:t>[37]</w:t>
-      </w:r>
-      <w:r>
-        <w:rPr>
-          <w:lang w:val="hr-HR"/>
-        </w:rPr>
-        <w:t xml:space="preserve"> </w:t>
-      </w:r>
-      <w:hyperlink r:id="rId31" w:history="1">
         <w:r>
           <w:rPr>
             <w:rStyle w:val="Hyperlink"/>
@@ -20023,7 +19887,7 @@
         </w:rPr>
         <w:t xml:space="preserve">[13] </w:t>
       </w:r>
-      <w:hyperlink r:id="rId32" w:history="1">
+      <w:hyperlink r:id="rId28" w:history="1">
         <w:r>
           <w:rPr>
             <w:rStyle w:val="Hyperlink"/>
@@ -20045,7 +19909,7 @@
         </w:rPr>
         <w:t xml:space="preserve">[14] </w:t>
       </w:r>
-      <w:hyperlink r:id="rId33" w:history="1">
+      <w:hyperlink r:id="rId29" w:history="1">
         <w:r>
           <w:rPr>
             <w:rStyle w:val="Hyperlink"/>
@@ -20073,7 +19937,7 @@
         </w:rPr>
         <w:t xml:space="preserve">[15] </w:t>
       </w:r>
-      <w:hyperlink r:id="rId34" w:history="1">
+      <w:hyperlink r:id="rId30" w:history="1">
         <w:r>
           <w:rPr>
             <w:rStyle w:val="Hyperlink"/>
@@ -20101,7 +19965,7 @@
         </w:rPr>
         <w:t xml:space="preserve">[16] </w:t>
       </w:r>
-      <w:hyperlink r:id="rId35" w:history="1">
+      <w:hyperlink r:id="rId31" w:history="1">
         <w:r>
           <w:rPr>
             <w:rStyle w:val="Hyperlink"/>
@@ -20129,7 +19993,7 @@
         </w:rPr>
         <w:t xml:space="preserve">[17] </w:t>
       </w:r>
-      <w:hyperlink r:id="rId36" w:history="1">
+      <w:hyperlink r:id="rId32" w:history="1">
         <w:r>
           <w:rPr>
             <w:rStyle w:val="Hyperlink"/>
@@ -20157,7 +20021,7 @@
         </w:rPr>
         <w:t xml:space="preserve">[18] </w:t>
       </w:r>
-      <w:hyperlink r:id="rId37" w:history="1">
+      <w:hyperlink r:id="rId33" w:history="1">
         <w:r>
           <w:rPr>
             <w:rStyle w:val="Hyperlink"/>
@@ -20185,7 +20049,7 @@
         </w:rPr>
         <w:t xml:space="preserve">[19] </w:t>
       </w:r>
-      <w:hyperlink r:id="rId38" w:history="1">
+      <w:hyperlink r:id="rId34" w:history="1">
         <w:r>
           <w:rPr>
             <w:rStyle w:val="Hyperlink"/>
@@ -20213,7 +20077,7 @@
         </w:rPr>
         <w:t xml:space="preserve">[20] </w:t>
       </w:r>
-      <w:hyperlink r:id="rId39" w:history="1">
+      <w:hyperlink r:id="rId35" w:history="1">
         <w:r>
           <w:rPr>
             <w:rStyle w:val="Hyperlink"/>
@@ -20241,7 +20105,7 @@
         </w:rPr>
         <w:t xml:space="preserve">[21] </w:t>
       </w:r>
-      <w:hyperlink r:id="rId40" w:history="1">
+      <w:hyperlink r:id="rId36" w:history="1">
         <w:r>
           <w:rPr>
             <w:rStyle w:val="Hyperlink"/>
@@ -20307,8 +20171,8 @@
       </w:pPr>
     </w:p>
     <w:sectPr>
-      <w:footerReference w:type="even" r:id="rId41"/>
-      <w:footerReference w:type="default" r:id="rId42"/>
+      <w:footerReference w:type="even" r:id="rId37"/>
+      <w:footerReference w:type="default" r:id="rId38"/>
       <w:pgSz w:w="11906" w:h="16838"/>
       <w:pgMar w:top="1440" w:right="1440" w:bottom="1440" w:left="1440" w:header="708" w:footer="708" w:gutter="0"/>
       <w:cols w:space="708"/>
@@ -20575,9 +20439,14 @@
       <w:r>
         <w:t xml:space="preserve"> </w:t>
       </w:r>
-      <w:r>
-        <w:t>Nbody-exoplanets</w:t>
-      </w:r>
+      <w:hyperlink r:id="rId4" w:history="1">
+        <w:r>
+          <w:rPr>
+            <w:rStyle w:val="Hyperlink"/>
+          </w:rPr>
+          <w:t>nbody_exoplanets github</w:t>
+        </w:r>
+      </w:hyperlink>
     </w:p>
   </w:footnote>
 </w:footnotes>

</xml_diff>

<commit_message>
enabled saving in case of crash
</commit_message>
<xml_diff>
--- a/writing/Natjecanje iz astronomije 2026.docx
+++ b/writing/Natjecanje iz astronomije 2026.docx
@@ -19805,176 +19805,6 @@
       <w:pPr>
         <w:rPr>
           <w:lang w:val="hr-HR"/>
-        </w:rPr>
-      </w:pPr>
-    </w:p>
-    <w:p>
-      <w:pPr>
-        <w:rPr>
-          <w:lang w:val="hr-HR"/>
-        </w:rPr>
-      </w:pPr>
-    </w:p>
-    <w:p>
-      <w:pPr>
-        <w:rPr>
-          <w:lang w:val="hr-HR"/>
-        </w:rPr>
-      </w:pPr>
-    </w:p>
-    <w:p>
-      <w:pPr>
-        <w:rPr>
-          <w:lang w:val="hr-HR"/>
-        </w:rPr>
-      </w:pPr>
-    </w:p>
-    <w:p>
-      <w:pPr>
-        <w:rPr>
-          <w:lang w:val="hr-HR"/>
-        </w:rPr>
-      </w:pPr>
-    </w:p>
-    <w:p>
-      <w:pPr>
-        <w:rPr>
-          <w:lang w:val="hr-HR"/>
-        </w:rPr>
-      </w:pPr>
-    </w:p>
-    <w:p>
-      <w:pPr>
-        <w:rPr>
-          <w:rFonts w:ascii="Courier New" w:eastAsia="Times New Roman" w:hAnsi="Courier New" w:cs="Courier New"/>
-          <w:color w:val="1F1F1F"/>
-          <w:kern w:val="0"/>
-          <w:sz w:val="21"/>
-          <w:szCs w:val="21"/>
-          <w:shd w:val="clear" w:color="auto" w:fill="FFFFFF"/>
-          <w:lang w:eastAsia="ja-JP"/>
-          <w14:ligatures w14:val="none"/>
-        </w:rPr>
-      </w:pPr>
-      <w:r>
-        <w:rPr>
-          <w:rFonts w:ascii="Courier New" w:eastAsia="Times New Roman" w:hAnsi="Courier New" w:cs="Courier New"/>
-          <w:color w:val="1F1F1F"/>
-          <w:kern w:val="0"/>
-          <w:sz w:val="21"/>
-          <w:szCs w:val="21"/>
-          <w:shd w:val="clear" w:color="auto" w:fill="FFFFFF"/>
-          <w:lang w:eastAsia="ja-JP"/>
-          <w14:ligatures w14:val="none"/>
-        </w:rPr>
-        <w:t>OK: LTT_1445_observed_ev0.2_iv090</w:t>
-      </w:r>
-    </w:p>
-    <w:p>
-      <w:pPr>
-        <w:rPr>
-          <w:rFonts w:ascii="Courier New" w:eastAsia="Times New Roman" w:hAnsi="Courier New" w:cs="Courier New"/>
-          <w:color w:val="1F1F1F"/>
-          <w:kern w:val="0"/>
-          <w:sz w:val="21"/>
-          <w:szCs w:val="21"/>
-          <w:shd w:val="clear" w:color="auto" w:fill="FFFFFF"/>
-          <w:lang w:eastAsia="ja-JP"/>
-          <w14:ligatures w14:val="none"/>
-        </w:rPr>
-      </w:pPr>
-      <w:r>
-        <w:rPr>
-          <w:rFonts w:ascii="Courier New" w:eastAsia="Times New Roman" w:hAnsi="Courier New" w:cs="Courier New"/>
-          <w:color w:val="1F1F1F"/>
-          <w:kern w:val="0"/>
-          <w:sz w:val="21"/>
-          <w:szCs w:val="21"/>
-          <w:shd w:val="clear" w:color="auto" w:fill="FFFFFF"/>
-          <w:lang w:eastAsia="ja-JP"/>
-          <w14:ligatures w14:val="none"/>
-        </w:rPr>
-        <w:t>OK: LTT_1445_observed_ev0.0_iv000</w:t>
-      </w:r>
-    </w:p>
-    <w:p>
-      <w:pPr>
-        <w:rPr>
-          <w:rFonts w:ascii="Courier New" w:eastAsia="Times New Roman" w:hAnsi="Courier New" w:cs="Courier New"/>
-          <w:color w:val="1F1F1F"/>
-          <w:kern w:val="0"/>
-          <w:sz w:val="21"/>
-          <w:szCs w:val="21"/>
-          <w:shd w:val="clear" w:color="auto" w:fill="FFFFFF"/>
-          <w:lang w:eastAsia="ja-JP"/>
-          <w14:ligatures w14:val="none"/>
-        </w:rPr>
-      </w:pPr>
-      <w:r>
-        <w:rPr>
-          <w:rFonts w:ascii="Courier New" w:eastAsia="Times New Roman" w:hAnsi="Courier New" w:cs="Courier New"/>
-          <w:color w:val="1F1F1F"/>
-          <w:kern w:val="0"/>
-          <w:sz w:val="21"/>
-          <w:szCs w:val="21"/>
-          <w:shd w:val="clear" w:color="auto" w:fill="FFFFFF"/>
-          <w:lang w:eastAsia="ja-JP"/>
-          <w14:ligatures w14:val="none"/>
-        </w:rPr>
-        <w:t>OK: LTT_1445_observed_ev0.4_iv090</w:t>
-      </w:r>
-    </w:p>
-    <w:p>
-      <w:pPr>
-        <w:rPr>
-          <w:rFonts w:ascii="Courier New" w:eastAsia="Times New Roman" w:hAnsi="Courier New" w:cs="Courier New"/>
-          <w:color w:val="1F1F1F"/>
-          <w:kern w:val="0"/>
-          <w:sz w:val="21"/>
-          <w:szCs w:val="21"/>
-          <w:shd w:val="clear" w:color="auto" w:fill="FFFFFF"/>
-          <w:lang w:eastAsia="ja-JP"/>
-          <w14:ligatures w14:val="none"/>
-        </w:rPr>
-      </w:pPr>
-      <w:r>
-        <w:rPr>
-          <w:rFonts w:ascii="Courier New" w:eastAsia="Times New Roman" w:hAnsi="Courier New" w:cs="Courier New"/>
-          <w:color w:val="1F1F1F"/>
-          <w:kern w:val="0"/>
-          <w:sz w:val="21"/>
-          <w:szCs w:val="21"/>
-          <w:shd w:val="clear" w:color="auto" w:fill="FFFFFF"/>
-          <w:lang w:eastAsia="ja-JP"/>
-          <w14:ligatures w14:val="none"/>
-        </w:rPr>
-        <w:t>OK: LTT_1445_observed_ev0.6_iv000</w:t>
-      </w:r>
-      <w:r>
-        <w:rPr>
-          <w:rFonts w:ascii="Courier New" w:eastAsia="Times New Roman" w:hAnsi="Courier New" w:cs="Courier New"/>
-          <w:color w:val="1F1F1F"/>
-          <w:kern w:val="0"/>
-          <w:sz w:val="21"/>
-          <w:szCs w:val="21"/>
-          <w:shd w:val="clear" w:color="auto" w:fill="FFFFFF"/>
-          <w:lang w:eastAsia="ja-JP"/>
-          <w14:ligatures w14:val="none"/>
-        </w:rPr>
-        <w:t xml:space="preserve"> used dt=1/20th</w:t>
-      </w:r>
-    </w:p>
-    <w:p>
-      <w:pPr>
-        <w:rPr>
-          <w:rFonts w:ascii="Courier New" w:eastAsia="Times New Roman" w:hAnsi="Courier New" w:cs="Courier New"/>
-          <w:color w:val="1F1F1F"/>
-          <w:kern w:val="0"/>
-          <w:sz w:val="21"/>
-          <w:szCs w:val="21"/>
-          <w:shd w:val="clear" w:color="auto" w:fill="FFFFFF"/>
-          <w:lang w:eastAsia="ja-JP"/>
-          <w14:ligatures w14:val="none"/>
         </w:rPr>
       </w:pPr>
     </w:p>

</xml_diff>